<commit_message>
Tuan04/Lab03/Xóa bớt 1 vài file không cần thiết và chỉnh lại cấu trúc bài làm
</commit_message>
<xml_diff>
--- a/Tuan4/Bao_Cao_Lab03_HousePrice.docx
+++ b/Tuan4/Bao_Cao_Lab03_HousePrice.docx
@@ -302,6 +302,7 @@
           <w:p>
             <w:pPr>
               <w:rPr>
+                <w:bCs/>
                 <w:sz w:val="26"/>
                 <w:szCs w:val="26"/>
               </w:rPr>
@@ -309,7 +310,7 @@
             <w:r>
               <w:rPr>
                 <w:rFonts w:ascii="Times New Roman" w:hAnsi="Times New Roman"/>
-                <w:b/>
+                <w:bCs/>
                 <w:sz w:val="26"/>
                 <w:szCs w:val="26"/>
               </w:rPr>
@@ -318,7 +319,7 @@
             <w:r>
               <w:rPr>
                 <w:rFonts w:ascii="Times New Roman" w:hAnsi="Times New Roman"/>
-                <w:b/>
+                <w:bCs/>
                 <w:sz w:val="26"/>
                 <w:szCs w:val="26"/>
               </w:rPr>
@@ -363,6 +364,7 @@
           <w:p>
             <w:pPr>
               <w:rPr>
+                <w:bCs/>
                 <w:sz w:val="26"/>
                 <w:szCs w:val="26"/>
               </w:rPr>
@@ -370,7 +372,7 @@
             <w:r>
               <w:rPr>
                 <w:rFonts w:ascii="Times New Roman" w:hAnsi="Times New Roman"/>
-                <w:b/>
+                <w:bCs/>
                 <w:sz w:val="26"/>
                 <w:szCs w:val="26"/>
               </w:rPr>
@@ -379,29 +381,29 @@
             <w:r>
               <w:rPr>
                 <w:rFonts w:ascii="Times New Roman" w:hAnsi="Times New Roman"/>
-                <w:b/>
-                <w:sz w:val="26"/>
-                <w:szCs w:val="26"/>
-              </w:rPr>
-              <w:t xml:space="preserve"> - 31234111</w:t>
+                <w:bCs/>
+                <w:sz w:val="26"/>
+                <w:szCs w:val="26"/>
+              </w:rPr>
+              <w:t>-</w:t>
             </w:r>
             <w:r>
               <w:rPr>
                 <w:rFonts w:ascii="Times New Roman" w:hAnsi="Times New Roman"/>
-                <w:b/>
-                <w:sz w:val="26"/>
-                <w:szCs w:val="26"/>
-              </w:rPr>
-              <w:t>5</w:t>
+                <w:bCs/>
+                <w:sz w:val="26"/>
+                <w:szCs w:val="26"/>
+              </w:rPr>
+              <w:t xml:space="preserve"> </w:t>
             </w:r>
             <w:r>
               <w:rPr>
                 <w:rFonts w:ascii="Times New Roman" w:hAnsi="Times New Roman"/>
-                <w:b/>
-                <w:sz w:val="26"/>
-                <w:szCs w:val="26"/>
-              </w:rPr>
-              <w:t>8</w:t>
+                <w:bCs/>
+                <w:sz w:val="26"/>
+                <w:szCs w:val="26"/>
+              </w:rPr>
+              <w:t>3123411158</w:t>
             </w:r>
           </w:p>
         </w:tc>
@@ -442,6 +444,7 @@
           <w:p>
             <w:pPr>
               <w:rPr>
+                <w:bCs/>
                 <w:sz w:val="26"/>
                 <w:szCs w:val="26"/>
               </w:rPr>
@@ -449,7 +452,7 @@
             <w:r>
               <w:rPr>
                 <w:rFonts w:ascii="Times New Roman" w:hAnsi="Times New Roman"/>
-                <w:b/>
+                <w:bCs/>
                 <w:sz w:val="26"/>
                 <w:szCs w:val="26"/>
               </w:rPr>
@@ -458,7 +461,7 @@
             <w:r>
               <w:rPr>
                 <w:rFonts w:ascii="Times New Roman" w:hAnsi="Times New Roman"/>
-                <w:b/>
+                <w:bCs/>
                 <w:sz w:val="26"/>
                 <w:szCs w:val="26"/>
               </w:rPr>
@@ -520,7 +523,23 @@
           <w:b/>
           <w:color w:val="000000" w:themeColor="text1"/>
         </w:rPr>
-        <w:t xml:space="preserve">THÀNH PHỐ HỒ CHÍ MINH, THÁNG 10 </w:t>
+        <w:t xml:space="preserve">THÀNH PHỐ HỒ CHÍ MINH, </w:t>
+      </w:r>
+      <w:r>
+        <w:rPr>
+          <w:rFonts w:ascii="Times New Roman" w:hAnsi="Times New Roman"/>
+          <w:b/>
+          <w:color w:val="000000" w:themeColor="text1"/>
+        </w:rPr>
+        <w:t xml:space="preserve">NG 7 </w:t>
+      </w:r>
+      <w:r>
+        <w:rPr>
+          <w:rFonts w:ascii="Times New Roman" w:hAnsi="Times New Roman"/>
+          <w:b/>
+          <w:color w:val="000000" w:themeColor="text1"/>
+        </w:rPr>
+        <w:t xml:space="preserve">THÁNG 10 </w:t>
       </w:r>
       <w:r>
         <w:rPr>
@@ -604,15 +623,19 @@
             <w:pPr>
               <w:jc w:val="center"/>
               <w:rPr>
-                <w:color w:val="000000" w:themeColor="text1"/>
+                <w:bCs/>
+                <w:color w:val="000000" w:themeColor="text1"/>
+                <w:sz w:val="26"/>
+                <w:szCs w:val="26"/>
               </w:rPr>
             </w:pPr>
             <w:r>
               <w:rPr>
                 <w:rFonts w:ascii="Times New Roman" w:hAnsi="Times New Roman"/>
-                <w:b/>
-                <w:color w:val="000000" w:themeColor="text1"/>
-                <w:sz w:val="20"/>
+                <w:bCs/>
+                <w:color w:val="000000" w:themeColor="text1"/>
+                <w:sz w:val="26"/>
+                <w:szCs w:val="26"/>
               </w:rPr>
               <w:t>Thành viên</w:t>
             </w:r>
@@ -633,15 +656,19 @@
             <w:pPr>
               <w:jc w:val="center"/>
               <w:rPr>
-                <w:color w:val="000000" w:themeColor="text1"/>
+                <w:bCs/>
+                <w:color w:val="000000" w:themeColor="text1"/>
+                <w:sz w:val="26"/>
+                <w:szCs w:val="26"/>
               </w:rPr>
             </w:pPr>
             <w:r>
               <w:rPr>
                 <w:rFonts w:ascii="Times New Roman" w:hAnsi="Times New Roman"/>
-                <w:b/>
-                <w:color w:val="000000" w:themeColor="text1"/>
-                <w:sz w:val="20"/>
+                <w:bCs/>
+                <w:color w:val="000000" w:themeColor="text1"/>
+                <w:sz w:val="26"/>
+                <w:szCs w:val="26"/>
               </w:rPr>
               <w:t>MSSV</w:t>
             </w:r>
@@ -662,15 +689,19 @@
             <w:pPr>
               <w:jc w:val="center"/>
               <w:rPr>
-                <w:color w:val="000000" w:themeColor="text1"/>
+                <w:bCs/>
+                <w:color w:val="000000" w:themeColor="text1"/>
+                <w:sz w:val="26"/>
+                <w:szCs w:val="26"/>
               </w:rPr>
             </w:pPr>
             <w:r>
               <w:rPr>
                 <w:rFonts w:ascii="Times New Roman" w:hAnsi="Times New Roman"/>
-                <w:b/>
-                <w:color w:val="000000" w:themeColor="text1"/>
-                <w:sz w:val="20"/>
+                <w:bCs/>
+                <w:color w:val="000000" w:themeColor="text1"/>
+                <w:sz w:val="26"/>
+                <w:szCs w:val="26"/>
               </w:rPr>
               <w:t>Vai trò</w:t>
             </w:r>
@@ -691,15 +722,19 @@
             <w:pPr>
               <w:jc w:val="center"/>
               <w:rPr>
-                <w:color w:val="000000" w:themeColor="text1"/>
+                <w:bCs/>
+                <w:color w:val="000000" w:themeColor="text1"/>
+                <w:sz w:val="26"/>
+                <w:szCs w:val="26"/>
               </w:rPr>
             </w:pPr>
             <w:r>
               <w:rPr>
                 <w:rFonts w:ascii="Times New Roman" w:hAnsi="Times New Roman"/>
-                <w:b/>
-                <w:color w:val="000000" w:themeColor="text1"/>
-                <w:sz w:val="20"/>
+                <w:bCs/>
+                <w:color w:val="000000" w:themeColor="text1"/>
+                <w:sz w:val="26"/>
+                <w:szCs w:val="26"/>
               </w:rPr>
               <w:t>Nhiệm vụ đảm nhiệm chính</w:t>
             </w:r>
@@ -720,15 +755,19 @@
             <w:pPr>
               <w:jc w:val="center"/>
               <w:rPr>
-                <w:color w:val="000000" w:themeColor="text1"/>
+                <w:bCs/>
+                <w:color w:val="000000" w:themeColor="text1"/>
+                <w:sz w:val="26"/>
+                <w:szCs w:val="26"/>
               </w:rPr>
             </w:pPr>
             <w:r>
               <w:rPr>
                 <w:rFonts w:ascii="Times New Roman" w:hAnsi="Times New Roman"/>
-                <w:b/>
-                <w:color w:val="000000" w:themeColor="text1"/>
-                <w:sz w:val="20"/>
+                <w:bCs/>
+                <w:color w:val="000000" w:themeColor="text1"/>
+                <w:sz w:val="26"/>
+                <w:szCs w:val="26"/>
               </w:rPr>
               <w:t>Đóng góp</w:t>
             </w:r>
@@ -753,14 +792,19 @@
           <w:p>
             <w:pPr>
               <w:rPr>
-                <w:color w:val="000000" w:themeColor="text1"/>
+                <w:bCs/>
+                <w:color w:val="000000" w:themeColor="text1"/>
+                <w:sz w:val="26"/>
+                <w:szCs w:val="26"/>
               </w:rPr>
             </w:pPr>
             <w:r>
               <w:rPr>
                 <w:rFonts w:ascii="Times New Roman" w:hAnsi="Times New Roman"/>
-                <w:color w:val="000000" w:themeColor="text1"/>
-                <w:sz w:val="19"/>
+                <w:bCs/>
+                <w:color w:val="000000" w:themeColor="text1"/>
+                <w:sz w:val="26"/>
+                <w:szCs w:val="26"/>
               </w:rPr>
               <w:t>Nguyễn Hữu Anh Khoa</w:t>
             </w:r>
@@ -782,29 +826,21 @@
               <w:jc w:val="center"/>
               <w:rPr>
                 <w:rFonts w:ascii="Times New Roman" w:hAnsi="Times New Roman" w:cs="Times New Roman"/>
-                <w:color w:val="000000" w:themeColor="text1"/>
+                <w:bCs/>
+                <w:color w:val="000000" w:themeColor="text1"/>
+                <w:sz w:val="26"/>
+                <w:szCs w:val="26"/>
               </w:rPr>
             </w:pPr>
             <w:r>
               <w:rPr>
                 <w:rFonts w:ascii="Times New Roman" w:hAnsi="Times New Roman" w:cs="Times New Roman"/>
-                <w:color w:val="000000" w:themeColor="text1"/>
-              </w:rPr>
-              <w:t>31234111</w:t>
-            </w:r>
-            <w:r>
-              <w:rPr>
-                <w:rFonts w:ascii="Times New Roman" w:hAnsi="Times New Roman" w:cs="Times New Roman"/>
-                <w:color w:val="000000" w:themeColor="text1"/>
-              </w:rPr>
-              <w:t>5</w:t>
-            </w:r>
-            <w:r>
-              <w:rPr>
-                <w:rFonts w:ascii="Times New Roman" w:hAnsi="Times New Roman" w:cs="Times New Roman"/>
-                <w:color w:val="000000" w:themeColor="text1"/>
-              </w:rPr>
-              <w:t>8</w:t>
+                <w:bCs/>
+                <w:color w:val="000000" w:themeColor="text1"/>
+                <w:sz w:val="26"/>
+                <w:szCs w:val="26"/>
+              </w:rPr>
+              <w:t>3123411158</w:t>
             </w:r>
           </w:p>
         </w:tc>
@@ -824,13 +860,19 @@
               <w:jc w:val="center"/>
               <w:rPr>
                 <w:rFonts w:ascii="Times New Roman" w:hAnsi="Times New Roman" w:cs="Times New Roman"/>
-                <w:color w:val="000000" w:themeColor="text1"/>
+                <w:bCs/>
+                <w:color w:val="000000" w:themeColor="text1"/>
+                <w:sz w:val="26"/>
+                <w:szCs w:val="26"/>
               </w:rPr>
             </w:pPr>
             <w:r>
               <w:rPr>
                 <w:rFonts w:ascii="Times New Roman" w:hAnsi="Times New Roman" w:cs="Times New Roman"/>
-                <w:color w:val="000000" w:themeColor="text1"/>
+                <w:bCs/>
+                <w:color w:val="000000" w:themeColor="text1"/>
+                <w:sz w:val="26"/>
+                <w:szCs w:val="26"/>
               </w:rPr>
               <w:t>Nhóm trưởng</w:t>
             </w:r>
@@ -850,14 +892,19 @@
           <w:p>
             <w:pPr>
               <w:rPr>
-                <w:color w:val="000000" w:themeColor="text1"/>
+                <w:bCs/>
+                <w:color w:val="000000" w:themeColor="text1"/>
+                <w:sz w:val="26"/>
+                <w:szCs w:val="26"/>
               </w:rPr>
             </w:pPr>
             <w:r>
               <w:rPr>
                 <w:rFonts w:ascii="Times New Roman" w:hAnsi="Times New Roman"/>
-                <w:color w:val="000000" w:themeColor="text1"/>
-                <w:sz w:val="19"/>
+                <w:bCs/>
+                <w:color w:val="000000" w:themeColor="text1"/>
+                <w:sz w:val="26"/>
+                <w:szCs w:val="26"/>
               </w:rPr>
               <w:t>EDA, Tiền xử lý thiếu, One-Hot Encoding, StandardScaler, Kỹ thuật đặc trưng (TotalSF, TotalBath...), Bàn giao 225 biến.</w:t>
             </w:r>
@@ -878,14 +925,19 @@
             <w:pPr>
               <w:jc w:val="center"/>
               <w:rPr>
-                <w:color w:val="000000" w:themeColor="text1"/>
+                <w:bCs/>
+                <w:color w:val="000000" w:themeColor="text1"/>
+                <w:sz w:val="26"/>
+                <w:szCs w:val="26"/>
               </w:rPr>
             </w:pPr>
             <w:r>
               <w:rPr>
                 <w:rFonts w:ascii="Times New Roman" w:hAnsi="Times New Roman"/>
-                <w:color w:val="000000" w:themeColor="text1"/>
-                <w:sz w:val="19"/>
+                <w:bCs/>
+                <w:color w:val="000000" w:themeColor="text1"/>
+                <w:sz w:val="26"/>
+                <w:szCs w:val="26"/>
               </w:rPr>
               <w:t>100%</w:t>
             </w:r>
@@ -910,14 +962,19 @@
           <w:p>
             <w:pPr>
               <w:rPr>
-                <w:color w:val="000000" w:themeColor="text1"/>
+                <w:bCs/>
+                <w:color w:val="000000" w:themeColor="text1"/>
+                <w:sz w:val="26"/>
+                <w:szCs w:val="26"/>
               </w:rPr>
             </w:pPr>
             <w:r>
               <w:rPr>
                 <w:rFonts w:ascii="Times New Roman" w:hAnsi="Times New Roman"/>
-                <w:color w:val="000000" w:themeColor="text1"/>
-                <w:sz w:val="19"/>
+                <w:bCs/>
+                <w:color w:val="000000" w:themeColor="text1"/>
+                <w:sz w:val="26"/>
+                <w:szCs w:val="26"/>
               </w:rPr>
               <w:t>Nguyễn Đức Tài</w:t>
             </w:r>
@@ -939,13 +996,19 @@
               <w:jc w:val="center"/>
               <w:rPr>
                 <w:rFonts w:ascii="Times New Roman" w:hAnsi="Times New Roman" w:cs="Times New Roman"/>
-                <w:color w:val="000000" w:themeColor="text1"/>
+                <w:bCs/>
+                <w:color w:val="000000" w:themeColor="text1"/>
+                <w:sz w:val="26"/>
+                <w:szCs w:val="26"/>
               </w:rPr>
             </w:pPr>
             <w:r>
               <w:rPr>
                 <w:rFonts w:ascii="Times New Roman" w:hAnsi="Times New Roman" w:cs="Times New Roman"/>
-                <w:color w:val="000000" w:themeColor="text1"/>
+                <w:bCs/>
+                <w:color w:val="000000" w:themeColor="text1"/>
+                <w:sz w:val="26"/>
+                <w:szCs w:val="26"/>
               </w:rPr>
               <w:t>3123411262</w:t>
             </w:r>
@@ -967,16 +1030,21 @@
               <w:jc w:val="center"/>
               <w:rPr>
                 <w:rFonts w:ascii="Times New Roman" w:hAnsi="Times New Roman" w:cs="Times New Roman"/>
-                <w:color w:val="000000" w:themeColor="text1"/>
+                <w:bCs/>
+                <w:color w:val="000000" w:themeColor="text1"/>
+                <w:sz w:val="26"/>
+                <w:szCs w:val="26"/>
               </w:rPr>
             </w:pPr>
             <w:r>
               <w:rPr>
                 <w:rFonts w:ascii="Times New Roman" w:hAnsi="Times New Roman" w:cs="Times New Roman"/>
-                <w:color w:val="000000" w:themeColor="text1"/>
-                <w:sz w:val="19"/>
-              </w:rPr>
-              <w:t>Thành viên B</w:t>
+                <w:bCs/>
+                <w:color w:val="000000" w:themeColor="text1"/>
+                <w:sz w:val="26"/>
+                <w:szCs w:val="26"/>
+              </w:rPr>
+              <w:t xml:space="preserve">Thành viên </w:t>
             </w:r>
           </w:p>
         </w:tc>
@@ -994,14 +1062,19 @@
           <w:p>
             <w:pPr>
               <w:rPr>
-                <w:color w:val="000000" w:themeColor="text1"/>
+                <w:bCs/>
+                <w:color w:val="000000" w:themeColor="text1"/>
+                <w:sz w:val="26"/>
+                <w:szCs w:val="26"/>
               </w:rPr>
             </w:pPr>
             <w:r>
               <w:rPr>
                 <w:rFonts w:ascii="Times New Roman" w:hAnsi="Times New Roman"/>
-                <w:color w:val="000000" w:themeColor="text1"/>
-                <w:sz w:val="19"/>
+                <w:bCs/>
+                <w:color w:val="000000" w:themeColor="text1"/>
+                <w:sz w:val="26"/>
+                <w:szCs w:val="26"/>
               </w:rPr>
               <w:t>7 mô hình Scikit-Learn baseline, Thử nghiệm chọn biến Top-N, Tinh chỉnh siêu tham số, Ensemble 4 mô hình, Nộp Kaggle (0.12573).</w:t>
             </w:r>
@@ -1022,14 +1095,19 @@
             <w:pPr>
               <w:jc w:val="center"/>
               <w:rPr>
-                <w:color w:val="000000" w:themeColor="text1"/>
+                <w:bCs/>
+                <w:color w:val="000000" w:themeColor="text1"/>
+                <w:sz w:val="26"/>
+                <w:szCs w:val="26"/>
               </w:rPr>
             </w:pPr>
             <w:r>
               <w:rPr>
                 <w:rFonts w:ascii="Times New Roman" w:hAnsi="Times New Roman"/>
-                <w:color w:val="000000" w:themeColor="text1"/>
-                <w:sz w:val="19"/>
+                <w:bCs/>
+                <w:color w:val="000000" w:themeColor="text1"/>
+                <w:sz w:val="26"/>
+                <w:szCs w:val="26"/>
               </w:rPr>
               <w:t>100%</w:t>
             </w:r>
@@ -1054,14 +1132,19 @@
           <w:p>
             <w:pPr>
               <w:rPr>
-                <w:color w:val="000000" w:themeColor="text1"/>
+                <w:bCs/>
+                <w:color w:val="000000" w:themeColor="text1"/>
+                <w:sz w:val="26"/>
+                <w:szCs w:val="26"/>
               </w:rPr>
             </w:pPr>
             <w:r>
               <w:rPr>
                 <w:rFonts w:ascii="Times New Roman" w:hAnsi="Times New Roman"/>
-                <w:color w:val="000000" w:themeColor="text1"/>
-                <w:sz w:val="19"/>
+                <w:bCs/>
+                <w:color w:val="000000" w:themeColor="text1"/>
+                <w:sz w:val="26"/>
+                <w:szCs w:val="26"/>
               </w:rPr>
               <w:t>Vũ Việt Hoàng</w:t>
             </w:r>
@@ -1084,6 +1167,8 @@
               <w:rPr>
                 <w:bCs/>
                 <w:color w:val="000000" w:themeColor="text1"/>
+                <w:sz w:val="26"/>
+                <w:szCs w:val="26"/>
               </w:rPr>
             </w:pPr>
             <w:r>
@@ -1091,6 +1176,8 @@
                 <w:rFonts w:ascii="Times New Roman" w:hAnsi="Times New Roman"/>
                 <w:bCs/>
                 <w:color w:val="000000" w:themeColor="text1"/>
+                <w:sz w:val="26"/>
+                <w:szCs w:val="26"/>
               </w:rPr>
               <w:t>3123411108</w:t>
             </w:r>
@@ -1112,15 +1199,21 @@
               <w:jc w:val="center"/>
               <w:rPr>
                 <w:rFonts w:ascii="Times New Roman" w:hAnsi="Times New Roman" w:cs="Times New Roman"/>
-                <w:color w:val="000000" w:themeColor="text1"/>
+                <w:bCs/>
+                <w:color w:val="000000" w:themeColor="text1"/>
+                <w:sz w:val="26"/>
+                <w:szCs w:val="26"/>
               </w:rPr>
             </w:pPr>
             <w:r>
               <w:rPr>
                 <w:rFonts w:ascii="Times New Roman" w:hAnsi="Times New Roman" w:cs="Times New Roman"/>
-                <w:color w:val="000000" w:themeColor="text1"/>
-              </w:rPr>
-              <w:t>Thành viên C</w:t>
+                <w:bCs/>
+                <w:color w:val="000000" w:themeColor="text1"/>
+                <w:sz w:val="26"/>
+                <w:szCs w:val="26"/>
+              </w:rPr>
+              <w:t xml:space="preserve">Thành viên </w:t>
             </w:r>
           </w:p>
         </w:tc>
@@ -1138,14 +1231,19 @@
           <w:p>
             <w:pPr>
               <w:rPr>
-                <w:color w:val="000000" w:themeColor="text1"/>
+                <w:bCs/>
+                <w:color w:val="000000" w:themeColor="text1"/>
+                <w:sz w:val="26"/>
+                <w:szCs w:val="26"/>
               </w:rPr>
             </w:pPr>
             <w:r>
               <w:rPr>
                 <w:rFonts w:ascii="Times New Roman" w:hAnsi="Times New Roman"/>
-                <w:color w:val="000000" w:themeColor="text1"/>
-                <w:sz w:val="19"/>
+                <w:bCs/>
+                <w:color w:val="000000" w:themeColor="text1"/>
+                <w:sz w:val="26"/>
+                <w:szCs w:val="26"/>
               </w:rPr>
               <w:t>Xây dựng mạng Deep Learning PyTorch MLP, DataLoader/Dataset, Huấn luyện 120 Epochs, Thực nghiệm đối chứng Top 50, Vẽ Sơ đồ luồng, Nhật ký thực nghiệm, Báo cáo &amp; Nộp bài.</w:t>
             </w:r>
@@ -1166,14 +1264,19 @@
             <w:pPr>
               <w:jc w:val="center"/>
               <w:rPr>
-                <w:color w:val="000000" w:themeColor="text1"/>
+                <w:bCs/>
+                <w:color w:val="000000" w:themeColor="text1"/>
+                <w:sz w:val="26"/>
+                <w:szCs w:val="26"/>
               </w:rPr>
             </w:pPr>
             <w:r>
               <w:rPr>
                 <w:rFonts w:ascii="Times New Roman" w:hAnsi="Times New Roman"/>
-                <w:color w:val="000000" w:themeColor="text1"/>
-                <w:sz w:val="19"/>
+                <w:bCs/>
+                <w:color w:val="000000" w:themeColor="text1"/>
+                <w:sz w:val="26"/>
+                <w:szCs w:val="26"/>
               </w:rPr>
               <w:t>100%</w:t>
             </w:r>
@@ -1232,16 +1335,22 @@
           <w:sz w:val="30"/>
         </w:rPr>
         <w:lastRenderedPageBreak/>
-        <w:t>TỔNG QUAN ĐỀ TÀI &amp; MỤC TIÊU DỰ ÁN</w:t>
+        <w:t>Tổng quan đề tài</w:t>
       </w:r>
     </w:p>
     <w:p>
       <w:pPr>
         <w:spacing w:after="80"/>
+        <w:rPr>
+          <w:sz w:val="26"/>
+          <w:szCs w:val="26"/>
+        </w:rPr>
       </w:pPr>
       <w:r>
         <w:rPr>
           <w:rFonts w:ascii="Times New Roman" w:hAnsi="Times New Roman"/>
+          <w:sz w:val="26"/>
+          <w:szCs w:val="26"/>
         </w:rPr>
         <w:t>Bài toán dự đoán giá nhà Ames Housing là bài toán hồi quy kinh điển thuộc cuộc thi 'House Prices: Advanced Regression Techniques' trên nền tảng Kaggle. Dữ liệu bao gồm 79 biến mô tả chi tiết các thuộc tính căn nhà tại Ames, Iowa.</w:t>
       </w:r>
@@ -1249,29 +1358,34 @@
     <w:p>
       <w:pPr>
         <w:spacing w:after="80"/>
+        <w:rPr>
+          <w:sz w:val="26"/>
+          <w:szCs w:val="26"/>
+        </w:rPr>
       </w:pPr>
       <w:r>
         <w:rPr>
           <w:rFonts w:ascii="Times New Roman" w:hAnsi="Times New Roman"/>
-          <w:b/>
+          <w:sz w:val="26"/>
+          <w:szCs w:val="26"/>
         </w:rPr>
-        <w:t xml:space="preserve">Mục tiêu: </w:t>
-      </w:r>
-      <w:r>
-        <w:rPr>
-          <w:rFonts w:ascii="Times New Roman" w:hAnsi="Times New Roman"/>
-        </w:rPr>
-        <w:t>Mục tiêu trọng tâm của đồ án:</w:t>
+        <w:t>Mục tiêu: Mục tiêu trọng tâm của đồ án:</w:t>
       </w:r>
     </w:p>
     <w:p>
       <w:pPr>
         <w:pStyle w:val="ListBullet"/>
         <w:spacing w:after="60"/>
+        <w:rPr>
+          <w:sz w:val="26"/>
+          <w:szCs w:val="26"/>
+        </w:rPr>
       </w:pPr>
       <w:r>
         <w:rPr>
           <w:rFonts w:ascii="Times New Roman" w:hAnsi="Times New Roman"/>
+          <w:sz w:val="26"/>
+          <w:szCs w:val="26"/>
         </w:rPr>
         <w:t>Thiết kế đường ống tiền xử lý dữ liệu (Data Preprocessing Pipeline) chuẩn hóa, giải quyết triệt để giá trị khuyết thiếu và biến đổi phân phối mục tiêu.</w:t>
       </w:r>
@@ -1280,10 +1394,16 @@
       <w:pPr>
         <w:pStyle w:val="ListBullet"/>
         <w:spacing w:after="60"/>
+        <w:rPr>
+          <w:sz w:val="26"/>
+          <w:szCs w:val="26"/>
+        </w:rPr>
       </w:pPr>
       <w:r>
         <w:rPr>
           <w:rFonts w:ascii="Times New Roman" w:hAnsi="Times New Roman"/>
+          <w:sz w:val="26"/>
+          <w:szCs w:val="26"/>
         </w:rPr>
         <w:t>Xây dựng, so sánh và tinh chỉnh các mô hình học máy truyền thống (Scikit-Learn) kết hợp chiến lược Ensemble để đạt điểm cao trên Kaggle.</w:t>
       </w:r>
@@ -1292,10 +1412,16 @@
       <w:pPr>
         <w:pStyle w:val="ListBullet"/>
         <w:spacing w:after="60"/>
+        <w:rPr>
+          <w:sz w:val="26"/>
+          <w:szCs w:val="26"/>
+        </w:rPr>
       </w:pPr>
       <w:r>
         <w:rPr>
           <w:rFonts w:ascii="Times New Roman" w:hAnsi="Times New Roman"/>
+          <w:sz w:val="26"/>
+          <w:szCs w:val="26"/>
         </w:rPr>
         <w:t>Thiết kế mạng nơ-ron học sâu (Deep Learning Multi-Layer Perceptron) bằng PyTorch, khảo sát sự hội tụ và so sánh khả năng biểu diễn của học sâu với các mô hình cây trên dữ liệu bảng (Tabular Data).</w:t>
       </w:r>
@@ -1304,10 +1430,16 @@
       <w:pPr>
         <w:pStyle w:val="ListBullet"/>
         <w:spacing w:after="60"/>
+        <w:rPr>
+          <w:sz w:val="26"/>
+          <w:szCs w:val="26"/>
+        </w:rPr>
       </w:pPr>
       <w:r>
         <w:rPr>
           <w:rFonts w:ascii="Times New Roman" w:hAnsi="Times New Roman"/>
+          <w:sz w:val="26"/>
+          <w:szCs w:val="26"/>
         </w:rPr>
         <w:t>Thước đo đánh giá: Root Mean Squared Logarithmic Error (RMSLE), tương đương RMSE trên thang đo log1p(SalePrice).</w:t>
       </w:r>
@@ -1326,111 +1458,120 @@
           <w:color w:val="000000" w:themeColor="text1"/>
           <w:sz w:val="30"/>
         </w:rPr>
-        <w:t>2. TIỀN XỬ LÝ &amp; KỸ THUẬT ĐẶC TRƯNG (NHÁNH A)</w:t>
+        <w:t xml:space="preserve">2. </w:t>
+      </w:r>
+      <w:r>
+        <w:rPr>
+          <w:rFonts w:ascii="Times New Roman" w:hAnsi="Times New Roman"/>
+          <w:b/>
+          <w:color w:val="000000" w:themeColor="text1"/>
+          <w:sz w:val="30"/>
+        </w:rPr>
+        <w:t>Tiền xử lý kĩ thuật đặc trưng</w:t>
+      </w:r>
+      <w:r>
+        <w:rPr>
+          <w:rFonts w:ascii="Times New Roman" w:hAnsi="Times New Roman"/>
+          <w:b/>
+          <w:color w:val="000000" w:themeColor="text1"/>
+          <w:sz w:val="30"/>
+        </w:rPr>
+        <w:t xml:space="preserve"> </w:t>
       </w:r>
     </w:p>
     <w:p>
       <w:pPr>
         <w:spacing w:after="80"/>
+        <w:rPr>
+          <w:bCs/>
+          <w:sz w:val="26"/>
+          <w:szCs w:val="26"/>
+        </w:rPr>
       </w:pPr>
       <w:r>
         <w:rPr>
           <w:rFonts w:ascii="Times New Roman" w:hAnsi="Times New Roman"/>
-          <w:b/>
+          <w:bCs/>
+          <w:sz w:val="26"/>
+          <w:szCs w:val="26"/>
         </w:rPr>
-        <w:t xml:space="preserve">• Biến đổi logarit: </w:t>
-      </w:r>
-      <w:r>
-        <w:rPr>
-          <w:rFonts w:ascii="Times New Roman" w:hAnsi="Times New Roman"/>
-        </w:rPr>
-        <w:t>Biến mục tiêu SalePrice có phân phối lệch dương (</w:t>
-      </w:r>
-      <w:proofErr w:type="gramStart"/>
-      <w:r>
-        <w:rPr>
-          <w:rFonts w:ascii="Times New Roman" w:hAnsi="Times New Roman"/>
-        </w:rPr>
-        <w:t>Right-skewed</w:t>
-      </w:r>
-      <w:proofErr w:type="gramEnd"/>
-      <w:r>
-        <w:rPr>
-          <w:rFonts w:ascii="Times New Roman" w:hAnsi="Times New Roman"/>
-        </w:rPr>
-        <w:t>) với đuôi dài. Áp dụng biến đổi y = log1p(SalePrice) đưa biến mục tiêu về dạng chuẩn Gauss (Mean ≈ 12.0241, Std ≈ 0.3994), triệt tiêu sự chi phối của các căn nhà có giá trị cá biệt.</w:t>
+        <w:t>• Biến đổi logarit: Biến mục tiêu SalePrice có phân phối lệch dương (Right-skewed) với đuôi dài. Áp dụng biến đổi y = log1p(SalePrice) đưa biến mục tiêu về dạng chuẩn Gauss (Mean ≈ 12.0241, Std ≈ 0.3994), triệt tiêu sự chi phối của các căn nhà có giá trị cá biệt.</w:t>
       </w:r>
     </w:p>
     <w:p>
       <w:pPr>
         <w:spacing w:after="80"/>
+        <w:rPr>
+          <w:bCs/>
+          <w:sz w:val="26"/>
+          <w:szCs w:val="26"/>
+        </w:rPr>
       </w:pPr>
       <w:r>
         <w:rPr>
           <w:rFonts w:ascii="Times New Roman" w:hAnsi="Times New Roman"/>
-          <w:b/>
+          <w:bCs/>
+          <w:sz w:val="26"/>
+          <w:szCs w:val="26"/>
         </w:rPr>
-        <w:t xml:space="preserve">• Xử lý khuyết thiếu (Missing values): </w:t>
-      </w:r>
-      <w:r>
-        <w:rPr>
-          <w:rFonts w:ascii="Times New Roman" w:hAnsi="Times New Roman"/>
-        </w:rPr>
-        <w:t>Các cột mà 'NA' mang nghĩa không có tiện ích (PoolQC, GarageType, BsmtQual...) được điền 'None'. Các cột số tương ứng (GarageArea, BsmtFinSF...) được điền 0. LotFrontage được điền theo Median của từng khu phố (Neighborhood). Các biến phân loại thông thường được điền bằng Mode.</w:t>
+        <w:t>• Xử lý khuyết thiếu (Missing values): Các cột mà 'NA' mang nghĩa không có tiện ích (PoolQC, GarageType, BsmtQual...) được điền 'None'. Các cột số tương ứng (GarageArea, BsmtFinSF...) được điền 0. LotFrontage được điền theo Median của từng khu phố (Neighborhood). Các biến phân loại thông thường được điền bằng Mode.</w:t>
       </w:r>
     </w:p>
     <w:p>
       <w:pPr>
         <w:spacing w:after="80"/>
+        <w:rPr>
+          <w:bCs/>
+          <w:sz w:val="26"/>
+          <w:szCs w:val="26"/>
+        </w:rPr>
       </w:pPr>
       <w:r>
         <w:rPr>
           <w:rFonts w:ascii="Times New Roman" w:hAnsi="Times New Roman"/>
-          <w:b/>
+          <w:bCs/>
+          <w:sz w:val="26"/>
+          <w:szCs w:val="26"/>
         </w:rPr>
-        <w:t xml:space="preserve">• Mã hóa biến (Encoding): </w:t>
-      </w:r>
-      <w:r>
-        <w:rPr>
-          <w:rFonts w:ascii="Times New Roman" w:hAnsi="Times New Roman"/>
-        </w:rPr>
-        <w:t>Ordinal Encoding cho 17 đặc trưng có thứ bậc chất lượng (Ex: 5, Gd: 4, TA: 3, Fa: 2, Po: 1, None: 0). Áp dụng One-Hot Encoding (pd.get_dummies) cho các biến phân loại danh định còn lại.</w:t>
+        <w:t>• Mã hóa biến (Encoding): Ordinal Encoding cho 17 đặc trưng có thứ bậc chất lượng (Ex: 5, Gd: 4, TA: 3, Fa: 2, Po: 1, None: 0). Áp dụng One-Hot Encoding (pd.get_dummies) cho các biến phân loại danh định còn lại.</w:t>
       </w:r>
     </w:p>
     <w:p>
       <w:pPr>
         <w:spacing w:after="80"/>
+        <w:rPr>
+          <w:bCs/>
+          <w:sz w:val="26"/>
+          <w:szCs w:val="26"/>
+        </w:rPr>
       </w:pPr>
       <w:r>
         <w:rPr>
           <w:rFonts w:ascii="Times New Roman" w:hAnsi="Times New Roman"/>
-          <w:b/>
+          <w:bCs/>
+          <w:sz w:val="26"/>
+          <w:szCs w:val="26"/>
         </w:rPr>
-        <w:t xml:space="preserve">• Sinh đặc trưng mới (Feature Engineering): </w:t>
-      </w:r>
-      <w:r>
-        <w:rPr>
-          <w:rFonts w:ascii="Times New Roman" w:hAnsi="Times New Roman"/>
-        </w:rPr>
-        <w:t>Sinh 5 biến nghiệp vụ mới: TotalSF = 1stFlrSF + 2ndFlrSF + TotalBsmtSF; TotalBath = FullBath + 0.5*HalfBath + BsmtFullBath + 0.5*BsmtHalfBath; HouseAge = YrSold - YearBuilt; RemodAge = YrSold - YearRemodAdd; HasPool = (PoolArea &gt; 0). Sau đó loại bỏ 9 cột gốc để triệt tiêu đa cộng tuyến.</w:t>
+        <w:t>• Sinh đặc trưng mới (Feature Engineering): Sinh 5 biến nghiệp vụ mới: TotalSF = 1stFlrSF + 2ndFlrSF + TotalBsmtSF; TotalBath = FullBath + 0.5*HalfBath + BsmtFullBath + 0.5*BsmtHalfBath; HouseAge = YrSold - YearBuilt; RemodAge = YrSold - YearRemodAdd; HasPool = (PoolArea &gt; 0). Sau đó loại bỏ 9 cột gốc để triệt tiêu đa cộng tuyến.</w:t>
       </w:r>
     </w:p>
     <w:p>
       <w:pPr>
         <w:spacing w:after="80"/>
+        <w:rPr>
+          <w:bCs/>
+          <w:sz w:val="26"/>
+          <w:szCs w:val="26"/>
+        </w:rPr>
       </w:pPr>
       <w:r>
         <w:rPr>
           <w:rFonts w:ascii="Times New Roman" w:hAnsi="Times New Roman"/>
-          <w:b/>
+          <w:bCs/>
+          <w:sz w:val="26"/>
+          <w:szCs w:val="26"/>
         </w:rPr>
-        <w:t xml:space="preserve">• Chuẩn hóa dữ liệu: </w:t>
-      </w:r>
-      <w:r>
-        <w:rPr>
-          <w:rFonts w:ascii="Times New Roman" w:hAnsi="Times New Roman"/>
-        </w:rPr>
-        <w:t>Áp dụng StandardScaler đưa toàn bộ 225 đặc trưng về phân phối chuẩn (Zero-mean, Unit-variance). Bàn giao các file: x_train.xlsx (1460×225), y_train.xlsx (1460×1), x_test.xlsx (1459×225).</w:t>
+        <w:t>• Chuẩn hóa dữ liệu: Áp dụng StandardScaler đưa toàn bộ 225 đặc trưng về phân phối chuẩn (Zero-mean, Unit-variance). Bàn giao các file: x_train.xlsx (1460×225), y_train.xlsx (1460×1), x_test.xlsx (1459×225).</w:t>
       </w:r>
     </w:p>
     <w:p>
@@ -1467,19 +1608,67 @@
           <w:sz w:val="30"/>
         </w:rPr>
         <w:lastRenderedPageBreak/>
-        <w:t>3. MÔ HÌNH HỌC MÁY SCIKIT-LEARN &amp; ENSEMBLE (NHÁNH B)</w:t>
+        <w:t>3. M</w:t>
+      </w:r>
+      <w:r>
+        <w:rPr>
+          <w:rFonts w:ascii="Times New Roman" w:hAnsi="Times New Roman"/>
+          <w:b/>
+          <w:color w:val="000000" w:themeColor="text1"/>
+          <w:sz w:val="30"/>
+        </w:rPr>
+        <w:t xml:space="preserve">ô hình máy học scikit </w:t>
+      </w:r>
+      <w:r>
+        <w:rPr>
+          <w:rFonts w:ascii="Times New Roman" w:hAnsi="Times New Roman"/>
+          <w:b/>
+          <w:color w:val="000000" w:themeColor="text1"/>
+          <w:sz w:val="30"/>
+        </w:rPr>
+        <w:t>-</w:t>
+      </w:r>
+      <w:r>
+        <w:rPr>
+          <w:rFonts w:ascii="Times New Roman" w:hAnsi="Times New Roman"/>
+          <w:b/>
+          <w:color w:val="000000" w:themeColor="text1"/>
+          <w:sz w:val="30"/>
+        </w:rPr>
+        <w:t>learn</w:t>
+      </w:r>
+      <w:r>
+        <w:rPr>
+          <w:rFonts w:ascii="Times New Roman" w:hAnsi="Times New Roman"/>
+          <w:b/>
+          <w:color w:val="000000" w:themeColor="text1"/>
+          <w:sz w:val="30"/>
+        </w:rPr>
+        <w:t xml:space="preserve"> </w:t>
+      </w:r>
+      <w:r>
+        <w:rPr>
+          <w:rFonts w:ascii="Times New Roman" w:hAnsi="Times New Roman"/>
+          <w:b/>
+          <w:color w:val="000000" w:themeColor="text1"/>
+          <w:sz w:val="30"/>
+        </w:rPr>
+        <w:t>và ensemble</w:t>
       </w:r>
     </w:p>
     <w:p>
       <w:pPr>
         <w:rPr>
           <w:rFonts w:ascii="Times New Roman" w:hAnsi="Times New Roman"/>
-          <w:b/>
+          <w:sz w:val="26"/>
+          <w:szCs w:val="26"/>
         </w:rPr>
       </w:pPr>
       <w:r>
         <w:rPr>
           <w:rFonts w:ascii="Times New Roman" w:hAnsi="Times New Roman"/>
+          <w:sz w:val="26"/>
+          <w:szCs w:val="26"/>
         </w:rPr>
         <w:t>Huấn luyện 7 mô hình baseline và thu được kết quả:</w:t>
       </w:r>
@@ -1525,14 +1714,16 @@
               <w:jc w:val="center"/>
               <w:rPr>
                 <w:color w:val="000000" w:themeColor="text1"/>
+                <w:sz w:val="26"/>
+                <w:szCs w:val="26"/>
               </w:rPr>
             </w:pPr>
             <w:r>
               <w:rPr>
                 <w:rFonts w:ascii="Times New Roman" w:hAnsi="Times New Roman"/>
-                <w:b/>
-                <w:color w:val="000000" w:themeColor="text1"/>
-                <w:sz w:val="19"/>
+                <w:color w:val="000000" w:themeColor="text1"/>
+                <w:sz w:val="26"/>
+                <w:szCs w:val="26"/>
               </w:rPr>
               <w:t>Mô hình</w:t>
             </w:r>
@@ -1554,14 +1745,16 @@
               <w:jc w:val="center"/>
               <w:rPr>
                 <w:color w:val="000000" w:themeColor="text1"/>
+                <w:sz w:val="26"/>
+                <w:szCs w:val="26"/>
               </w:rPr>
             </w:pPr>
             <w:r>
               <w:rPr>
                 <w:rFonts w:ascii="Times New Roman" w:hAnsi="Times New Roman"/>
-                <w:b/>
-                <w:color w:val="000000" w:themeColor="text1"/>
-                <w:sz w:val="19"/>
+                <w:color w:val="000000" w:themeColor="text1"/>
+                <w:sz w:val="26"/>
+                <w:szCs w:val="26"/>
               </w:rPr>
               <w:t>Val RMSE</w:t>
             </w:r>
@@ -1583,14 +1776,16 @@
               <w:jc w:val="center"/>
               <w:rPr>
                 <w:color w:val="000000" w:themeColor="text1"/>
+                <w:sz w:val="26"/>
+                <w:szCs w:val="26"/>
               </w:rPr>
             </w:pPr>
             <w:r>
               <w:rPr>
                 <w:rFonts w:ascii="Times New Roman" w:hAnsi="Times New Roman"/>
-                <w:b/>
-                <w:color w:val="000000" w:themeColor="text1"/>
-                <w:sz w:val="19"/>
+                <w:color w:val="000000" w:themeColor="text1"/>
+                <w:sz w:val="26"/>
+                <w:szCs w:val="26"/>
               </w:rPr>
               <w:t>Val MAE</w:t>
             </w:r>
@@ -1612,14 +1807,16 @@
               <w:jc w:val="center"/>
               <w:rPr>
                 <w:color w:val="000000" w:themeColor="text1"/>
+                <w:sz w:val="26"/>
+                <w:szCs w:val="26"/>
               </w:rPr>
             </w:pPr>
             <w:r>
               <w:rPr>
                 <w:rFonts w:ascii="Times New Roman" w:hAnsi="Times New Roman"/>
-                <w:b/>
-                <w:color w:val="000000" w:themeColor="text1"/>
-                <w:sz w:val="19"/>
+                <w:color w:val="000000" w:themeColor="text1"/>
+                <w:sz w:val="26"/>
+                <w:szCs w:val="26"/>
               </w:rPr>
               <w:t>Val R²</w:t>
             </w:r>
@@ -1641,14 +1838,16 @@
               <w:jc w:val="center"/>
               <w:rPr>
                 <w:color w:val="000000" w:themeColor="text1"/>
+                <w:sz w:val="26"/>
+                <w:szCs w:val="26"/>
               </w:rPr>
             </w:pPr>
             <w:r>
               <w:rPr>
                 <w:rFonts w:ascii="Times New Roman" w:hAnsi="Times New Roman"/>
-                <w:b/>
-                <w:color w:val="000000" w:themeColor="text1"/>
-                <w:sz w:val="19"/>
+                <w:color w:val="000000" w:themeColor="text1"/>
+                <w:sz w:val="26"/>
+                <w:szCs w:val="26"/>
               </w:rPr>
               <w:t>Thời gian (s)</w:t>
             </w:r>
@@ -1673,16 +1872,17 @@
           <w:p>
             <w:pPr>
               <w:rPr>
-                <w:bCs/>
-                <w:color w:val="000000" w:themeColor="text1"/>
+                <w:color w:val="000000" w:themeColor="text1"/>
+                <w:sz w:val="26"/>
+                <w:szCs w:val="26"/>
               </w:rPr>
             </w:pPr>
             <w:r>
               <w:rPr>
                 <w:rFonts w:ascii="Times New Roman" w:hAnsi="Times New Roman"/>
-                <w:bCs/>
-                <w:color w:val="000000" w:themeColor="text1"/>
-                <w:sz w:val="19"/>
+                <w:color w:val="000000" w:themeColor="text1"/>
+                <w:sz w:val="26"/>
+                <w:szCs w:val="26"/>
               </w:rPr>
               <w:t>Lasso (alpha=0.001)</w:t>
             </w:r>
@@ -1703,16 +1903,17 @@
             <w:pPr>
               <w:jc w:val="center"/>
               <w:rPr>
-                <w:bCs/>
-                <w:color w:val="000000" w:themeColor="text1"/>
+                <w:color w:val="000000" w:themeColor="text1"/>
+                <w:sz w:val="26"/>
+                <w:szCs w:val="26"/>
               </w:rPr>
             </w:pPr>
             <w:r>
               <w:rPr>
                 <w:rFonts w:ascii="Times New Roman" w:hAnsi="Times New Roman"/>
-                <w:bCs/>
-                <w:color w:val="000000" w:themeColor="text1"/>
-                <w:sz w:val="19"/>
+                <w:color w:val="000000" w:themeColor="text1"/>
+                <w:sz w:val="26"/>
+                <w:szCs w:val="26"/>
               </w:rPr>
               <w:t>0.1194</w:t>
             </w:r>
@@ -1733,16 +1934,17 @@
             <w:pPr>
               <w:jc w:val="center"/>
               <w:rPr>
-                <w:bCs/>
-                <w:color w:val="000000" w:themeColor="text1"/>
+                <w:color w:val="000000" w:themeColor="text1"/>
+                <w:sz w:val="26"/>
+                <w:szCs w:val="26"/>
               </w:rPr>
             </w:pPr>
             <w:r>
               <w:rPr>
                 <w:rFonts w:ascii="Times New Roman" w:hAnsi="Times New Roman"/>
-                <w:bCs/>
-                <w:color w:val="000000" w:themeColor="text1"/>
-                <w:sz w:val="19"/>
+                <w:color w:val="000000" w:themeColor="text1"/>
+                <w:sz w:val="26"/>
+                <w:szCs w:val="26"/>
               </w:rPr>
               <w:t>0.0841</w:t>
             </w:r>
@@ -1763,16 +1965,17 @@
             <w:pPr>
               <w:jc w:val="center"/>
               <w:rPr>
-                <w:bCs/>
-                <w:color w:val="000000" w:themeColor="text1"/>
+                <w:color w:val="000000" w:themeColor="text1"/>
+                <w:sz w:val="26"/>
+                <w:szCs w:val="26"/>
               </w:rPr>
             </w:pPr>
             <w:r>
               <w:rPr>
                 <w:rFonts w:ascii="Times New Roman" w:hAnsi="Times New Roman"/>
-                <w:bCs/>
-                <w:color w:val="000000" w:themeColor="text1"/>
-                <w:sz w:val="19"/>
+                <w:color w:val="000000" w:themeColor="text1"/>
+                <w:sz w:val="26"/>
+                <w:szCs w:val="26"/>
               </w:rPr>
               <w:t>0.9236</w:t>
             </w:r>
@@ -1793,16 +1996,17 @@
             <w:pPr>
               <w:jc w:val="center"/>
               <w:rPr>
-                <w:bCs/>
-                <w:color w:val="000000" w:themeColor="text1"/>
+                <w:color w:val="000000" w:themeColor="text1"/>
+                <w:sz w:val="26"/>
+                <w:szCs w:val="26"/>
               </w:rPr>
             </w:pPr>
             <w:r>
               <w:rPr>
                 <w:rFonts w:ascii="Times New Roman" w:hAnsi="Times New Roman"/>
-                <w:bCs/>
-                <w:color w:val="000000" w:themeColor="text1"/>
-                <w:sz w:val="19"/>
+                <w:color w:val="000000" w:themeColor="text1"/>
+                <w:sz w:val="26"/>
+                <w:szCs w:val="26"/>
               </w:rPr>
               <w:t>0.05</w:t>
             </w:r>
@@ -1828,13 +2032,16 @@
             <w:pPr>
               <w:rPr>
                 <w:color w:val="000000" w:themeColor="text1"/>
+                <w:sz w:val="26"/>
+                <w:szCs w:val="26"/>
               </w:rPr>
             </w:pPr>
             <w:r>
               <w:rPr>
                 <w:rFonts w:ascii="Times New Roman" w:hAnsi="Times New Roman"/>
                 <w:color w:val="000000" w:themeColor="text1"/>
-                <w:sz w:val="19"/>
+                <w:sz w:val="26"/>
+                <w:szCs w:val="26"/>
               </w:rPr>
               <w:t>ElasticNet (a=0.001, l1=0.5)</w:t>
             </w:r>
@@ -1856,13 +2063,16 @@
               <w:jc w:val="center"/>
               <w:rPr>
                 <w:color w:val="000000" w:themeColor="text1"/>
+                <w:sz w:val="26"/>
+                <w:szCs w:val="26"/>
               </w:rPr>
             </w:pPr>
             <w:r>
               <w:rPr>
                 <w:rFonts w:ascii="Times New Roman" w:hAnsi="Times New Roman"/>
                 <w:color w:val="000000" w:themeColor="text1"/>
-                <w:sz w:val="19"/>
+                <w:sz w:val="26"/>
+                <w:szCs w:val="26"/>
               </w:rPr>
               <w:t>0.1206</w:t>
             </w:r>
@@ -1884,13 +2094,16 @@
               <w:jc w:val="center"/>
               <w:rPr>
                 <w:color w:val="000000" w:themeColor="text1"/>
+                <w:sz w:val="26"/>
+                <w:szCs w:val="26"/>
               </w:rPr>
             </w:pPr>
             <w:r>
               <w:rPr>
                 <w:rFonts w:ascii="Times New Roman" w:hAnsi="Times New Roman"/>
                 <w:color w:val="000000" w:themeColor="text1"/>
-                <w:sz w:val="19"/>
+                <w:sz w:val="26"/>
+                <w:szCs w:val="26"/>
               </w:rPr>
               <w:t>0.0853</w:t>
             </w:r>
@@ -1912,13 +2125,16 @@
               <w:jc w:val="center"/>
               <w:rPr>
                 <w:color w:val="000000" w:themeColor="text1"/>
+                <w:sz w:val="26"/>
+                <w:szCs w:val="26"/>
               </w:rPr>
             </w:pPr>
             <w:r>
               <w:rPr>
                 <w:rFonts w:ascii="Times New Roman" w:hAnsi="Times New Roman"/>
                 <w:color w:val="000000" w:themeColor="text1"/>
-                <w:sz w:val="19"/>
+                <w:sz w:val="26"/>
+                <w:szCs w:val="26"/>
               </w:rPr>
               <w:t>0.9220</w:t>
             </w:r>
@@ -1940,13 +2156,16 @@
               <w:jc w:val="center"/>
               <w:rPr>
                 <w:color w:val="000000" w:themeColor="text1"/>
+                <w:sz w:val="26"/>
+                <w:szCs w:val="26"/>
               </w:rPr>
             </w:pPr>
             <w:r>
               <w:rPr>
                 <w:rFonts w:ascii="Times New Roman" w:hAnsi="Times New Roman"/>
                 <w:color w:val="000000" w:themeColor="text1"/>
-                <w:sz w:val="19"/>
+                <w:sz w:val="26"/>
+                <w:szCs w:val="26"/>
               </w:rPr>
               <w:t>0.07</w:t>
             </w:r>
@@ -1972,13 +2191,16 @@
             <w:pPr>
               <w:rPr>
                 <w:color w:val="000000" w:themeColor="text1"/>
+                <w:sz w:val="26"/>
+                <w:szCs w:val="26"/>
               </w:rPr>
             </w:pPr>
             <w:r>
               <w:rPr>
                 <w:rFonts w:ascii="Times New Roman" w:hAnsi="Times New Roman"/>
                 <w:color w:val="000000" w:themeColor="text1"/>
-                <w:sz w:val="19"/>
+                <w:sz w:val="26"/>
+                <w:szCs w:val="26"/>
               </w:rPr>
               <w:t>Ridge Regression (alpha=10)</w:t>
             </w:r>
@@ -2000,13 +2222,16 @@
               <w:jc w:val="center"/>
               <w:rPr>
                 <w:color w:val="000000" w:themeColor="text1"/>
+                <w:sz w:val="26"/>
+                <w:szCs w:val="26"/>
               </w:rPr>
             </w:pPr>
             <w:r>
               <w:rPr>
                 <w:rFonts w:ascii="Times New Roman" w:hAnsi="Times New Roman"/>
                 <w:color w:val="000000" w:themeColor="text1"/>
-                <w:sz w:val="19"/>
+                <w:sz w:val="26"/>
+                <w:szCs w:val="26"/>
               </w:rPr>
               <w:t>0.1218</w:t>
             </w:r>
@@ -2028,13 +2253,16 @@
               <w:jc w:val="center"/>
               <w:rPr>
                 <w:color w:val="000000" w:themeColor="text1"/>
+                <w:sz w:val="26"/>
+                <w:szCs w:val="26"/>
               </w:rPr>
             </w:pPr>
             <w:r>
               <w:rPr>
                 <w:rFonts w:ascii="Times New Roman" w:hAnsi="Times New Roman"/>
                 <w:color w:val="000000" w:themeColor="text1"/>
-                <w:sz w:val="19"/>
+                <w:sz w:val="26"/>
+                <w:szCs w:val="26"/>
               </w:rPr>
               <w:t>0.0864</w:t>
             </w:r>
@@ -2056,13 +2284,16 @@
               <w:jc w:val="center"/>
               <w:rPr>
                 <w:color w:val="000000" w:themeColor="text1"/>
+                <w:sz w:val="26"/>
+                <w:szCs w:val="26"/>
               </w:rPr>
             </w:pPr>
             <w:r>
               <w:rPr>
                 <w:rFonts w:ascii="Times New Roman" w:hAnsi="Times New Roman"/>
                 <w:color w:val="000000" w:themeColor="text1"/>
-                <w:sz w:val="19"/>
+                <w:sz w:val="26"/>
+                <w:szCs w:val="26"/>
               </w:rPr>
               <w:t>0.9205</w:t>
             </w:r>
@@ -2084,13 +2315,16 @@
               <w:jc w:val="center"/>
               <w:rPr>
                 <w:color w:val="000000" w:themeColor="text1"/>
+                <w:sz w:val="26"/>
+                <w:szCs w:val="26"/>
               </w:rPr>
             </w:pPr>
             <w:r>
               <w:rPr>
                 <w:rFonts w:ascii="Times New Roman" w:hAnsi="Times New Roman"/>
                 <w:color w:val="000000" w:themeColor="text1"/>
-                <w:sz w:val="19"/>
+                <w:sz w:val="26"/>
+                <w:szCs w:val="26"/>
               </w:rPr>
               <w:t>0.01</w:t>
             </w:r>
@@ -2116,13 +2350,16 @@
             <w:pPr>
               <w:rPr>
                 <w:color w:val="000000" w:themeColor="text1"/>
+                <w:sz w:val="26"/>
+                <w:szCs w:val="26"/>
               </w:rPr>
             </w:pPr>
             <w:r>
               <w:rPr>
                 <w:rFonts w:ascii="Times New Roman" w:hAnsi="Times New Roman"/>
                 <w:color w:val="000000" w:themeColor="text1"/>
-                <w:sz w:val="19"/>
+                <w:sz w:val="26"/>
+                <w:szCs w:val="26"/>
               </w:rPr>
               <w:t>Linear Regression</w:t>
             </w:r>
@@ -2144,13 +2381,16 @@
               <w:jc w:val="center"/>
               <w:rPr>
                 <w:color w:val="000000" w:themeColor="text1"/>
+                <w:sz w:val="26"/>
+                <w:szCs w:val="26"/>
               </w:rPr>
             </w:pPr>
             <w:r>
               <w:rPr>
                 <w:rFonts w:ascii="Times New Roman" w:hAnsi="Times New Roman"/>
                 <w:color w:val="000000" w:themeColor="text1"/>
-                <w:sz w:val="19"/>
+                <w:sz w:val="26"/>
+                <w:szCs w:val="26"/>
               </w:rPr>
               <w:t>0.1220</w:t>
             </w:r>
@@ -2172,13 +2412,16 @@
               <w:jc w:val="center"/>
               <w:rPr>
                 <w:color w:val="000000" w:themeColor="text1"/>
+                <w:sz w:val="26"/>
+                <w:szCs w:val="26"/>
               </w:rPr>
             </w:pPr>
             <w:r>
               <w:rPr>
                 <w:rFonts w:ascii="Times New Roman" w:hAnsi="Times New Roman"/>
                 <w:color w:val="000000" w:themeColor="text1"/>
-                <w:sz w:val="19"/>
+                <w:sz w:val="26"/>
+                <w:szCs w:val="26"/>
               </w:rPr>
               <w:t>0.0866</w:t>
             </w:r>
@@ -2200,13 +2443,16 @@
               <w:jc w:val="center"/>
               <w:rPr>
                 <w:color w:val="000000" w:themeColor="text1"/>
+                <w:sz w:val="26"/>
+                <w:szCs w:val="26"/>
               </w:rPr>
             </w:pPr>
             <w:r>
               <w:rPr>
                 <w:rFonts w:ascii="Times New Roman" w:hAnsi="Times New Roman"/>
                 <w:color w:val="000000" w:themeColor="text1"/>
-                <w:sz w:val="19"/>
+                <w:sz w:val="26"/>
+                <w:szCs w:val="26"/>
               </w:rPr>
               <w:t>0.9202</w:t>
             </w:r>
@@ -2228,13 +2474,16 @@
               <w:jc w:val="center"/>
               <w:rPr>
                 <w:color w:val="000000" w:themeColor="text1"/>
+                <w:sz w:val="26"/>
+                <w:szCs w:val="26"/>
               </w:rPr>
             </w:pPr>
             <w:r>
               <w:rPr>
                 <w:rFonts w:ascii="Times New Roman" w:hAnsi="Times New Roman"/>
                 <w:color w:val="000000" w:themeColor="text1"/>
-                <w:sz w:val="19"/>
+                <w:sz w:val="26"/>
+                <w:szCs w:val="26"/>
               </w:rPr>
               <w:t>0.03</w:t>
             </w:r>
@@ -2260,13 +2509,16 @@
             <w:pPr>
               <w:rPr>
                 <w:color w:val="000000" w:themeColor="text1"/>
+                <w:sz w:val="26"/>
+                <w:szCs w:val="26"/>
               </w:rPr>
             </w:pPr>
             <w:r>
               <w:rPr>
                 <w:rFonts w:ascii="Times New Roman" w:hAnsi="Times New Roman"/>
                 <w:color w:val="000000" w:themeColor="text1"/>
-                <w:sz w:val="19"/>
+                <w:sz w:val="26"/>
+                <w:szCs w:val="26"/>
               </w:rPr>
               <w:t>Gradient Boosting (500 cây)</w:t>
             </w:r>
@@ -2288,13 +2540,16 @@
               <w:jc w:val="center"/>
               <w:rPr>
                 <w:color w:val="000000" w:themeColor="text1"/>
+                <w:sz w:val="26"/>
+                <w:szCs w:val="26"/>
               </w:rPr>
             </w:pPr>
             <w:r>
               <w:rPr>
                 <w:rFonts w:ascii="Times New Roman" w:hAnsi="Times New Roman"/>
                 <w:color w:val="000000" w:themeColor="text1"/>
-                <w:sz w:val="19"/>
+                <w:sz w:val="26"/>
+                <w:szCs w:val="26"/>
               </w:rPr>
               <w:t>0.1395</w:t>
             </w:r>
@@ -2316,13 +2571,16 @@
               <w:jc w:val="center"/>
               <w:rPr>
                 <w:color w:val="000000" w:themeColor="text1"/>
+                <w:sz w:val="26"/>
+                <w:szCs w:val="26"/>
               </w:rPr>
             </w:pPr>
             <w:r>
               <w:rPr>
                 <w:rFonts w:ascii="Times New Roman" w:hAnsi="Times New Roman"/>
                 <w:color w:val="000000" w:themeColor="text1"/>
-                <w:sz w:val="19"/>
+                <w:sz w:val="26"/>
+                <w:szCs w:val="26"/>
               </w:rPr>
               <w:t>0.0913</w:t>
             </w:r>
@@ -2344,13 +2602,16 @@
               <w:jc w:val="center"/>
               <w:rPr>
                 <w:color w:val="000000" w:themeColor="text1"/>
+                <w:sz w:val="26"/>
+                <w:szCs w:val="26"/>
               </w:rPr>
             </w:pPr>
             <w:r>
               <w:rPr>
                 <w:rFonts w:ascii="Times New Roman" w:hAnsi="Times New Roman"/>
                 <w:color w:val="000000" w:themeColor="text1"/>
-                <w:sz w:val="19"/>
+                <w:sz w:val="26"/>
+                <w:szCs w:val="26"/>
               </w:rPr>
               <w:t>0.8957</w:t>
             </w:r>
@@ -2372,13 +2633,16 @@
               <w:jc w:val="center"/>
               <w:rPr>
                 <w:color w:val="000000" w:themeColor="text1"/>
+                <w:sz w:val="26"/>
+                <w:szCs w:val="26"/>
               </w:rPr>
             </w:pPr>
             <w:r>
               <w:rPr>
                 <w:rFonts w:ascii="Times New Roman" w:hAnsi="Times New Roman"/>
                 <w:color w:val="000000" w:themeColor="text1"/>
-                <w:sz w:val="19"/>
+                <w:sz w:val="26"/>
+                <w:szCs w:val="26"/>
               </w:rPr>
               <w:t>3.99</w:t>
             </w:r>
@@ -2404,13 +2668,16 @@
             <w:pPr>
               <w:rPr>
                 <w:color w:val="000000" w:themeColor="text1"/>
+                <w:sz w:val="26"/>
+                <w:szCs w:val="26"/>
               </w:rPr>
             </w:pPr>
             <w:r>
               <w:rPr>
                 <w:rFonts w:ascii="Times New Roman" w:hAnsi="Times New Roman"/>
                 <w:color w:val="000000" w:themeColor="text1"/>
-                <w:sz w:val="19"/>
+                <w:sz w:val="26"/>
+                <w:szCs w:val="26"/>
               </w:rPr>
               <w:t>HistGradientBoosting</w:t>
             </w:r>
@@ -2432,13 +2699,16 @@
               <w:jc w:val="center"/>
               <w:rPr>
                 <w:color w:val="000000" w:themeColor="text1"/>
+                <w:sz w:val="26"/>
+                <w:szCs w:val="26"/>
               </w:rPr>
             </w:pPr>
             <w:r>
               <w:rPr>
                 <w:rFonts w:ascii="Times New Roman" w:hAnsi="Times New Roman"/>
                 <w:color w:val="000000" w:themeColor="text1"/>
-                <w:sz w:val="19"/>
+                <w:sz w:val="26"/>
+                <w:szCs w:val="26"/>
               </w:rPr>
               <w:t>0.1408</w:t>
             </w:r>
@@ -2460,13 +2730,16 @@
               <w:jc w:val="center"/>
               <w:rPr>
                 <w:color w:val="000000" w:themeColor="text1"/>
+                <w:sz w:val="26"/>
+                <w:szCs w:val="26"/>
               </w:rPr>
             </w:pPr>
             <w:r>
               <w:rPr>
                 <w:rFonts w:ascii="Times New Roman" w:hAnsi="Times New Roman"/>
                 <w:color w:val="000000" w:themeColor="text1"/>
-                <w:sz w:val="19"/>
+                <w:sz w:val="26"/>
+                <w:szCs w:val="26"/>
               </w:rPr>
               <w:t>0.0921</w:t>
             </w:r>
@@ -2488,13 +2761,16 @@
               <w:jc w:val="center"/>
               <w:rPr>
                 <w:color w:val="000000" w:themeColor="text1"/>
+                <w:sz w:val="26"/>
+                <w:szCs w:val="26"/>
               </w:rPr>
             </w:pPr>
             <w:r>
               <w:rPr>
                 <w:rFonts w:ascii="Times New Roman" w:hAnsi="Times New Roman"/>
                 <w:color w:val="000000" w:themeColor="text1"/>
-                <w:sz w:val="19"/>
+                <w:sz w:val="26"/>
+                <w:szCs w:val="26"/>
               </w:rPr>
               <w:t>0.8938</w:t>
             </w:r>
@@ -2516,13 +2792,16 @@
               <w:jc w:val="center"/>
               <w:rPr>
                 <w:color w:val="000000" w:themeColor="text1"/>
+                <w:sz w:val="26"/>
+                <w:szCs w:val="26"/>
               </w:rPr>
             </w:pPr>
             <w:r>
               <w:rPr>
                 <w:rFonts w:ascii="Times New Roman" w:hAnsi="Times New Roman"/>
                 <w:color w:val="000000" w:themeColor="text1"/>
-                <w:sz w:val="19"/>
+                <w:sz w:val="26"/>
+                <w:szCs w:val="26"/>
               </w:rPr>
               <w:t>1.35</w:t>
             </w:r>
@@ -2548,13 +2827,16 @@
             <w:pPr>
               <w:rPr>
                 <w:color w:val="000000" w:themeColor="text1"/>
+                <w:sz w:val="26"/>
+                <w:szCs w:val="26"/>
               </w:rPr>
             </w:pPr>
             <w:r>
               <w:rPr>
                 <w:rFonts w:ascii="Times New Roman" w:hAnsi="Times New Roman"/>
                 <w:color w:val="000000" w:themeColor="text1"/>
-                <w:sz w:val="19"/>
+                <w:sz w:val="26"/>
+                <w:szCs w:val="26"/>
               </w:rPr>
               <w:t>Random Forest (300 cây)</w:t>
             </w:r>
@@ -2576,13 +2858,16 @@
               <w:jc w:val="center"/>
               <w:rPr>
                 <w:color w:val="000000" w:themeColor="text1"/>
+                <w:sz w:val="26"/>
+                <w:szCs w:val="26"/>
               </w:rPr>
             </w:pPr>
             <w:r>
               <w:rPr>
                 <w:rFonts w:ascii="Times New Roman" w:hAnsi="Times New Roman"/>
                 <w:color w:val="000000" w:themeColor="text1"/>
-                <w:sz w:val="19"/>
+                <w:sz w:val="26"/>
+                <w:szCs w:val="26"/>
               </w:rPr>
               <w:t>0.1458</w:t>
             </w:r>
@@ -2604,13 +2889,16 @@
               <w:jc w:val="center"/>
               <w:rPr>
                 <w:color w:val="000000" w:themeColor="text1"/>
+                <w:sz w:val="26"/>
+                <w:szCs w:val="26"/>
               </w:rPr>
             </w:pPr>
             <w:r>
               <w:rPr>
                 <w:rFonts w:ascii="Times New Roman" w:hAnsi="Times New Roman"/>
                 <w:color w:val="000000" w:themeColor="text1"/>
-                <w:sz w:val="19"/>
+                <w:sz w:val="26"/>
+                <w:szCs w:val="26"/>
               </w:rPr>
               <w:t>0.0944</w:t>
             </w:r>
@@ -2632,13 +2920,16 @@
               <w:jc w:val="center"/>
               <w:rPr>
                 <w:color w:val="000000" w:themeColor="text1"/>
+                <w:sz w:val="26"/>
+                <w:szCs w:val="26"/>
               </w:rPr>
             </w:pPr>
             <w:r>
               <w:rPr>
                 <w:rFonts w:ascii="Times New Roman" w:hAnsi="Times New Roman"/>
                 <w:color w:val="000000" w:themeColor="text1"/>
-                <w:sz w:val="19"/>
+                <w:sz w:val="26"/>
+                <w:szCs w:val="26"/>
               </w:rPr>
               <w:t>0.8861</w:t>
             </w:r>
@@ -2660,13 +2951,16 @@
               <w:jc w:val="center"/>
               <w:rPr>
                 <w:color w:val="000000" w:themeColor="text1"/>
+                <w:sz w:val="26"/>
+                <w:szCs w:val="26"/>
               </w:rPr>
             </w:pPr>
             <w:r>
               <w:rPr>
                 <w:rFonts w:ascii="Times New Roman" w:hAnsi="Times New Roman"/>
                 <w:color w:val="000000" w:themeColor="text1"/>
-                <w:sz w:val="19"/>
+                <w:sz w:val="26"/>
+                <w:szCs w:val="26"/>
               </w:rPr>
               <w:t>2.37</w:t>
             </w:r>
@@ -2677,37 +2971,35 @@
     <w:p>
       <w:pPr>
         <w:spacing w:after="80"/>
+        <w:rPr>
+          <w:sz w:val="26"/>
+          <w:szCs w:val="26"/>
+        </w:rPr>
       </w:pPr>
       <w:r>
         <w:rPr>
           <w:rFonts w:ascii="Times New Roman" w:hAnsi="Times New Roman"/>
-          <w:b/>
+          <w:sz w:val="26"/>
+          <w:szCs w:val="26"/>
         </w:rPr>
-        <w:t xml:space="preserve">• Tinh chỉnh siêu tham số: </w:t>
-      </w:r>
-      <w:r>
-        <w:rPr>
-          <w:rFonts w:ascii="Times New Roman" w:hAnsi="Times New Roman"/>
-        </w:rPr>
-        <w:t>Sử dụng GridSearchCV cho mô hình tuyến tính (Ridge alpha=300, ElasticNet alpha=0.002, l1=0.8) và RandomizedSearchCV cho Boosting (GBR 489 cây, HistGB 595 iter).</w:t>
+        <w:t>• Tinh chỉnh siêu tham số: Sử dụng GridSearchCV cho mô hình tuyến tính (Ridge alpha=300, ElasticNet alpha=0.002, l1=0.8) và RandomizedSearchCV cho Boosting (GBR 489 cây, HistGB 595 iter).</w:t>
       </w:r>
     </w:p>
     <w:p>
       <w:pPr>
         <w:spacing w:after="80"/>
+        <w:rPr>
+          <w:sz w:val="26"/>
+          <w:szCs w:val="26"/>
+        </w:rPr>
       </w:pPr>
       <w:r>
         <w:rPr>
           <w:rFonts w:ascii="Times New Roman" w:hAnsi="Times New Roman"/>
-          <w:b/>
+          <w:sz w:val="26"/>
+          <w:szCs w:val="26"/>
         </w:rPr>
-        <w:t xml:space="preserve">• Ensemble &amp; Kết quả Kaggle: </w:t>
-      </w:r>
-      <w:r>
-        <w:rPr>
-          <w:rFonts w:ascii="Times New Roman" w:hAnsi="Times New Roman"/>
-        </w:rPr>
-        <w:t>Mặc dù mô hình tuyến tính đạt Val RMSE tốt trên tập Val 292 mẫu, nhưng độ lệch chuẩn trên 5-Fold CV rất cao (std 0.043–0.050). Do đó, Thành viên B chọn mô hình Ensemble trung bình đều của 4 mô hình đã tune (ElasticNet, Ridge, GBR, HistGB). Mô hình này đạt 5-Fold CV RMSE = 0.1259 (tốt nhất và ổn định nhất). Nộp file submission_sklearn.csv lên Kaggle và đạt điểm Public Score: 0.12573.</w:t>
+        <w:t>• Ensemble &amp; Kết quả Kaggle: Mặc dù mô hình tuyến tính đạt Val RMSE tốt trên tập Val 292 mẫu, nhưng độ lệch chuẩn trên 5-Fold CV rất cao (std 0.043–0.050). Do đó, Thành viên B chọn mô hình Ensemble trung bình đều của 4 mô hình đã tune (ElasticNet, Ridge, GBR, HistGB). Mô hình này đạt 5-Fold CV RMSE = 0.1259 (tốt nhất và ổn định nhất). Nộp file submission_sklearn.csv lên Kaggle và đạt điểm Public Score: 0.12573.</w:t>
       </w:r>
     </w:p>
     <w:p>
@@ -2724,7 +3016,25 @@
           <w:color w:val="000000" w:themeColor="text1"/>
           <w:sz w:val="30"/>
         </w:rPr>
-        <w:t>4. XÂY DỰNG MẠNG DEEP LEARNING PYTORCH MLP (NHÁNH C)</w:t>
+        <w:t xml:space="preserve">4. </w:t>
+      </w:r>
+      <w:r>
+        <w:rPr>
+          <w:rFonts w:ascii="Times New Roman" w:hAnsi="Times New Roman"/>
+          <w:b/>
+          <w:color w:val="000000" w:themeColor="text1"/>
+          <w:sz w:val="30"/>
+        </w:rPr>
+        <w:t xml:space="preserve">Xây dựng MLP pytorch </w:t>
+      </w:r>
+      <w:r>
+        <w:rPr>
+          <w:rFonts w:ascii="Times New Roman" w:hAnsi="Times New Roman"/>
+          <w:b/>
+          <w:color w:val="000000" w:themeColor="text1"/>
+          <w:sz w:val="30"/>
+        </w:rPr>
+        <w:t xml:space="preserve"> </w:t>
       </w:r>
     </w:p>
     <w:p>
@@ -2747,10 +3057,16 @@
     <w:p>
       <w:pPr>
         <w:spacing w:after="80"/>
+        <w:rPr>
+          <w:sz w:val="26"/>
+          <w:szCs w:val="26"/>
+        </w:rPr>
       </w:pPr>
       <w:r>
         <w:rPr>
           <w:rFonts w:ascii="Times New Roman" w:hAnsi="Times New Roman"/>
+          <w:sz w:val="26"/>
+          <w:szCs w:val="26"/>
         </w:rPr>
         <w:t>Mạng nơ-ron được thiết kế theo cấu trúc truyền thẳng 3 tầng ẩn chuẩn học sâu:</w:t>
       </w:r>
@@ -2759,10 +3075,16 @@
       <w:pPr>
         <w:pStyle w:val="ListBullet"/>
         <w:spacing w:after="60"/>
+        <w:rPr>
+          <w:sz w:val="26"/>
+          <w:szCs w:val="26"/>
+        </w:rPr>
       </w:pPr>
       <w:r>
         <w:rPr>
           <w:rFonts w:ascii="Times New Roman" w:hAnsi="Times New Roman"/>
+          <w:sz w:val="26"/>
+          <w:szCs w:val="26"/>
         </w:rPr>
         <w:t>Tầng Input: 225 đặc trưng đầu vào sau chuẩn hóa.</w:t>
       </w:r>
@@ -2771,10 +3093,16 @@
       <w:pPr>
         <w:pStyle w:val="ListBullet"/>
         <w:spacing w:after="60"/>
+        <w:rPr>
+          <w:sz w:val="26"/>
+          <w:szCs w:val="26"/>
+        </w:rPr>
       </w:pPr>
       <w:r>
         <w:rPr>
           <w:rFonts w:ascii="Times New Roman" w:hAnsi="Times New Roman"/>
+          <w:sz w:val="26"/>
+          <w:szCs w:val="26"/>
         </w:rPr>
         <w:t>Tầng ẩn 1: Linear(225 → 128) + ReLU() + Dropout(p = 0.2). Chứa 28,928 tham số.</w:t>
       </w:r>
@@ -2783,10 +3111,16 @@
       <w:pPr>
         <w:pStyle w:val="ListBullet"/>
         <w:spacing w:after="60"/>
+        <w:rPr>
+          <w:sz w:val="26"/>
+          <w:szCs w:val="26"/>
+        </w:rPr>
       </w:pPr>
       <w:r>
         <w:rPr>
           <w:rFonts w:ascii="Times New Roman" w:hAnsi="Times New Roman"/>
+          <w:sz w:val="26"/>
+          <w:szCs w:val="26"/>
         </w:rPr>
         <w:t>Tầng ẩn 2: Linear(128 → 64) + ReLU() + Dropout(p = 0.2). Chứa 8,256 tham số.</w:t>
       </w:r>
@@ -2795,10 +3129,16 @@
       <w:pPr>
         <w:pStyle w:val="ListBullet"/>
         <w:spacing w:after="60"/>
+        <w:rPr>
+          <w:sz w:val="26"/>
+          <w:szCs w:val="26"/>
+        </w:rPr>
       </w:pPr>
       <w:r>
         <w:rPr>
           <w:rFonts w:ascii="Times New Roman" w:hAnsi="Times New Roman"/>
+          <w:sz w:val="26"/>
+          <w:szCs w:val="26"/>
         </w:rPr>
         <w:t>Tầng Output: Linear(64 → 1). Chứa 65 tham số. Dự đoán giá trị liên tục.</w:t>
       </w:r>
@@ -2811,8 +3151,17 @@
       <w:r>
         <w:rPr>
           <w:rFonts w:ascii="Times New Roman" w:hAnsi="Times New Roman"/>
+          <w:sz w:val="26"/>
+          <w:szCs w:val="26"/>
         </w:rPr>
-        <w:t>Tổng số tham số có thể huấn luyện: 37,121 tham số.</w:t>
+        <w:lastRenderedPageBreak/>
+        <w:t>Tổng số tham số có thể huấn luyện: 37,121 tham số</w:t>
+      </w:r>
+      <w:r>
+        <w:rPr>
+          <w:rFonts w:ascii="Times New Roman" w:hAnsi="Times New Roman"/>
+        </w:rPr>
+        <w:t>.</w:t>
       </w:r>
     </w:p>
     <w:p>
@@ -2820,6 +3169,8 @@
         <w:spacing w:before="200" w:after="80"/>
         <w:rPr>
           <w:color w:val="000000" w:themeColor="text1"/>
+          <w:sz w:val="26"/>
+          <w:szCs w:val="26"/>
         </w:rPr>
       </w:pPr>
       <w:r>
@@ -2828,20 +3179,46 @@
           <w:b/>
           <w:color w:val="000000" w:themeColor="text1"/>
           <w:sz w:val="26"/>
+          <w:szCs w:val="26"/>
         </w:rPr>
-        <w:t>4.2. Kỹ thuật tiền xử lý Tensor &amp; Quản lý dữ liệu</w:t>
+        <w:t xml:space="preserve">4.2. Kỹ thuật tiền xử lý Tensor </w:t>
+      </w:r>
+      <w:r>
+        <w:rPr>
+          <w:rFonts w:ascii="Times New Roman" w:hAnsi="Times New Roman"/>
+          <w:b/>
+          <w:color w:val="000000" w:themeColor="text1"/>
+          <w:sz w:val="26"/>
+          <w:szCs w:val="26"/>
+        </w:rPr>
+        <w:t>và q</w:t>
+      </w:r>
+      <w:r>
+        <w:rPr>
+          <w:rFonts w:ascii="Times New Roman" w:hAnsi="Times New Roman"/>
+          <w:b/>
+          <w:color w:val="000000" w:themeColor="text1"/>
+          <w:sz w:val="26"/>
+          <w:szCs w:val="26"/>
+        </w:rPr>
+        <w:t>uản lý dữ liệu</w:t>
       </w:r>
     </w:p>
     <w:p>
       <w:pPr>
         <w:pStyle w:val="ListBullet"/>
         <w:spacing w:after="60"/>
+        <w:rPr>
+          <w:sz w:val="26"/>
+          <w:szCs w:val="26"/>
+        </w:rPr>
       </w:pPr>
       <w:r>
         <w:rPr>
           <w:rFonts w:ascii="Times New Roman" w:hAnsi="Times New Roman"/>
+          <w:sz w:val="26"/>
+          <w:szCs w:val="26"/>
         </w:rPr>
-        <w:lastRenderedPageBreak/>
         <w:t>Target Normalization: Chuẩn hóa biến mục tiêu log1p(SalePrice) về Zero-mean và Unit-variance (y_mean = 12.0307, y_std = 0.3904). Kỹ thuật này triệt tiêu hiện tượng gradient bùng nổ, giúp mạng hội tụ ổn định ngay từ Epoch đầu tiên.</w:t>
       </w:r>
     </w:p>
@@ -2849,10 +3226,16 @@
       <w:pPr>
         <w:pStyle w:val="ListBullet"/>
         <w:spacing w:after="60"/>
+        <w:rPr>
+          <w:sz w:val="26"/>
+          <w:szCs w:val="26"/>
+        </w:rPr>
       </w:pPr>
       <w:r>
         <w:rPr>
           <w:rFonts w:ascii="Times New Roman" w:hAnsi="Times New Roman"/>
+          <w:sz w:val="26"/>
+          <w:szCs w:val="26"/>
         </w:rPr>
         <w:t>CustomDataset &amp; DataLoader: Xây dựng HousePriceDataset kế thừa torch.utils.data.Dataset; DataLoader huấn luyện với Batch Size = 32 (shuffle=True) và kiểm định với Batch Size = 64.</w:t>
       </w:r>
@@ -2862,6 +3245,8 @@
         <w:spacing w:before="200" w:after="80"/>
         <w:rPr>
           <w:color w:val="000000" w:themeColor="text1"/>
+          <w:sz w:val="26"/>
+          <w:szCs w:val="26"/>
         </w:rPr>
       </w:pPr>
       <w:r>
@@ -2870,18 +3255,45 @@
           <w:b/>
           <w:color w:val="000000" w:themeColor="text1"/>
           <w:sz w:val="26"/>
+          <w:szCs w:val="26"/>
         </w:rPr>
-        <w:t>4.3. Huấn luyện &amp; Đánh giá mô hình</w:t>
+        <w:t>4.3. Huấn luyện</w:t>
+      </w:r>
+      <w:r>
+        <w:rPr>
+          <w:rFonts w:ascii="Times New Roman" w:hAnsi="Times New Roman"/>
+          <w:b/>
+          <w:color w:val="000000" w:themeColor="text1"/>
+          <w:sz w:val="26"/>
+          <w:szCs w:val="26"/>
+        </w:rPr>
+        <w:t xml:space="preserve"> và đ</w:t>
+      </w:r>
+      <w:r>
+        <w:rPr>
+          <w:rFonts w:ascii="Times New Roman" w:hAnsi="Times New Roman"/>
+          <w:b/>
+          <w:color w:val="000000" w:themeColor="text1"/>
+          <w:sz w:val="26"/>
+          <w:szCs w:val="26"/>
+        </w:rPr>
+        <w:t>ánh giá mô hình</w:t>
       </w:r>
     </w:p>
     <w:p>
       <w:pPr>
         <w:pStyle w:val="ListBullet"/>
         <w:spacing w:after="60"/>
+        <w:rPr>
+          <w:sz w:val="26"/>
+          <w:szCs w:val="26"/>
+        </w:rPr>
       </w:pPr>
       <w:r>
         <w:rPr>
           <w:rFonts w:ascii="Times New Roman" w:hAnsi="Times New Roman"/>
+          <w:sz w:val="26"/>
+          <w:szCs w:val="26"/>
         </w:rPr>
         <w:t>Hàm mất mát: nn.MSELoss().</w:t>
       </w:r>
@@ -2890,10 +3302,16 @@
       <w:pPr>
         <w:pStyle w:val="ListBullet"/>
         <w:spacing w:after="60"/>
+        <w:rPr>
+          <w:sz w:val="26"/>
+          <w:szCs w:val="26"/>
+        </w:rPr>
       </w:pPr>
       <w:r>
         <w:rPr>
           <w:rFonts w:ascii="Times New Roman" w:hAnsi="Times New Roman"/>
+          <w:sz w:val="26"/>
+          <w:szCs w:val="26"/>
         </w:rPr>
         <w:t>Optimizer: Adam (Initial LR = 0.001, Weight Decay = 0.001 đóng vai trò điều chuẩn L2).</w:t>
       </w:r>
@@ -2902,10 +3320,16 @@
       <w:pPr>
         <w:pStyle w:val="ListBullet"/>
         <w:spacing w:after="60"/>
+        <w:rPr>
+          <w:sz w:val="26"/>
+          <w:szCs w:val="26"/>
+        </w:rPr>
       </w:pPr>
       <w:r>
         <w:rPr>
           <w:rFonts w:ascii="Times New Roman" w:hAnsi="Times New Roman"/>
+          <w:sz w:val="26"/>
+          <w:szCs w:val="26"/>
         </w:rPr>
         <w:t>Bộ lập lịch học: ReduceLROnPlateau (factor=0.5, patience=8, min_lr=1e-5).</w:t>
       </w:r>
@@ -2914,10 +3338,16 @@
       <w:pPr>
         <w:pStyle w:val="ListBullet"/>
         <w:spacing w:after="60"/>
+        <w:rPr>
+          <w:sz w:val="26"/>
+          <w:szCs w:val="26"/>
+        </w:rPr>
       </w:pPr>
       <w:r>
         <w:rPr>
           <w:rFonts w:ascii="Times New Roman" w:hAnsi="Times New Roman"/>
+          <w:sz w:val="26"/>
+          <w:szCs w:val="26"/>
         </w:rPr>
         <w:t>Thời gian thực thi: 120 Epochs trên GPU CUDA hoàn tất trong 7.29 giây.</w:t>
       </w:r>
@@ -2926,10 +3356,16 @@
       <w:pPr>
         <w:pStyle w:val="ListBullet"/>
         <w:spacing w:after="60"/>
+        <w:rPr>
+          <w:sz w:val="26"/>
+          <w:szCs w:val="26"/>
+        </w:rPr>
       </w:pPr>
       <w:r>
         <w:rPr>
           <w:rFonts w:ascii="Times New Roman" w:hAnsi="Times New Roman"/>
+          <w:sz w:val="26"/>
+          <w:szCs w:val="26"/>
         </w:rPr>
         <w:t>Kết quả tối ưu: Mô hình chạm mốc Validation RMSE = 0.1252 (R² = 0.9123, MAE = 0.0902) tại Epoch 30. Trọng số tốt nhất được lưu và nạp lại để dự đoán.</w:t>
       </w:r>
@@ -3007,6 +3443,7 @@
         <w:rPr>
           <w:noProof/>
         </w:rPr>
+        <w:lastRenderedPageBreak/>
         <w:drawing>
           <wp:inline distT="0" distB="0" distL="0" distR="0" wp14:anchorId="7EA5BD68" wp14:editId="37603E76">
             <wp:extent cx="5669280" cy="1982609"/>
@@ -3092,7 +3529,16 @@
           <w:sz w:val="30"/>
         </w:rPr>
         <w:lastRenderedPageBreak/>
-        <w:t>5. THỰC NGHIỆM ĐỐI CHỨNG (ABLATION) &amp; ĐÍNH CHÍNH SỐ LIỆU</w:t>
+        <w:t xml:space="preserve">5. </w:t>
+      </w:r>
+      <w:r>
+        <w:rPr>
+          <w:rFonts w:ascii="Times New Roman" w:hAnsi="Times New Roman"/>
+          <w:b/>
+          <w:color w:val="000000" w:themeColor="text1"/>
+          <w:sz w:val="30"/>
+        </w:rPr>
+        <w:t>Thực nghiệm đối chứng và đính chình số liệu</w:t>
       </w:r>
     </w:p>
     <w:tbl>
@@ -3137,6 +3583,8 @@
               <w:rPr>
                 <w:bCs/>
                 <w:color w:val="000000" w:themeColor="text1"/>
+                <w:sz w:val="26"/>
+                <w:szCs w:val="26"/>
               </w:rPr>
             </w:pPr>
             <w:r>
@@ -3144,7 +3592,8 @@
                 <w:rFonts w:ascii="Times New Roman" w:hAnsi="Times New Roman"/>
                 <w:bCs/>
                 <w:color w:val="000000" w:themeColor="text1"/>
-                <w:sz w:val="19"/>
+                <w:sz w:val="26"/>
+                <w:szCs w:val="26"/>
               </w:rPr>
               <w:t>Mô hình</w:t>
             </w:r>
@@ -3167,6 +3616,8 @@
               <w:rPr>
                 <w:bCs/>
                 <w:color w:val="000000" w:themeColor="text1"/>
+                <w:sz w:val="26"/>
+                <w:szCs w:val="26"/>
               </w:rPr>
             </w:pPr>
             <w:r>
@@ -3174,7 +3625,8 @@
                 <w:rFonts w:ascii="Times New Roman" w:hAnsi="Times New Roman"/>
                 <w:bCs/>
                 <w:color w:val="000000" w:themeColor="text1"/>
-                <w:sz w:val="19"/>
+                <w:sz w:val="26"/>
+                <w:szCs w:val="26"/>
               </w:rPr>
               <w:t>225 đặc trưng</w:t>
             </w:r>
@@ -3197,6 +3649,8 @@
               <w:rPr>
                 <w:bCs/>
                 <w:color w:val="000000" w:themeColor="text1"/>
+                <w:sz w:val="26"/>
+                <w:szCs w:val="26"/>
               </w:rPr>
             </w:pPr>
             <w:r>
@@ -3204,7 +3658,8 @@
                 <w:rFonts w:ascii="Times New Roman" w:hAnsi="Times New Roman"/>
                 <w:bCs/>
                 <w:color w:val="000000" w:themeColor="text1"/>
-                <w:sz w:val="19"/>
+                <w:sz w:val="26"/>
+                <w:szCs w:val="26"/>
               </w:rPr>
               <w:t>Top 50 đặc trưng</w:t>
             </w:r>
@@ -3227,6 +3682,8 @@
               <w:rPr>
                 <w:bCs/>
                 <w:color w:val="000000" w:themeColor="text1"/>
+                <w:sz w:val="26"/>
+                <w:szCs w:val="26"/>
               </w:rPr>
             </w:pPr>
             <w:r>
@@ -3234,7 +3691,8 @@
                 <w:rFonts w:ascii="Times New Roman" w:hAnsi="Times New Roman"/>
                 <w:bCs/>
                 <w:color w:val="000000" w:themeColor="text1"/>
-                <w:sz w:val="19"/>
+                <w:sz w:val="26"/>
+                <w:szCs w:val="26"/>
               </w:rPr>
               <w:t>Độ lệch RMSE</w:t>
             </w:r>
@@ -3257,6 +3715,8 @@
               <w:rPr>
                 <w:bCs/>
                 <w:color w:val="000000" w:themeColor="text1"/>
+                <w:sz w:val="26"/>
+                <w:szCs w:val="26"/>
               </w:rPr>
             </w:pPr>
             <w:r>
@@ -3264,7 +3724,8 @@
                 <w:rFonts w:ascii="Times New Roman" w:hAnsi="Times New Roman"/>
                 <w:bCs/>
                 <w:color w:val="000000" w:themeColor="text1"/>
-                <w:sz w:val="19"/>
+                <w:sz w:val="26"/>
+                <w:szCs w:val="26"/>
               </w:rPr>
               <w:t>Nhận xét xu hướng</w:t>
             </w:r>
@@ -3291,6 +3752,8 @@
               <w:rPr>
                 <w:bCs/>
                 <w:color w:val="000000" w:themeColor="text1"/>
+                <w:sz w:val="26"/>
+                <w:szCs w:val="26"/>
               </w:rPr>
             </w:pPr>
             <w:r>
@@ -3298,7 +3761,8 @@
                 <w:rFonts w:ascii="Times New Roman" w:hAnsi="Times New Roman"/>
                 <w:bCs/>
                 <w:color w:val="000000" w:themeColor="text1"/>
-                <w:sz w:val="19"/>
+                <w:sz w:val="26"/>
+                <w:szCs w:val="26"/>
               </w:rPr>
               <w:t>Gradient Boosting (GBR)</w:t>
             </w:r>
@@ -3321,6 +3785,8 @@
               <w:rPr>
                 <w:bCs/>
                 <w:color w:val="000000" w:themeColor="text1"/>
+                <w:sz w:val="26"/>
+                <w:szCs w:val="26"/>
               </w:rPr>
             </w:pPr>
             <w:r>
@@ -3328,7 +3794,8 @@
                 <w:rFonts w:ascii="Times New Roman" w:hAnsi="Times New Roman"/>
                 <w:bCs/>
                 <w:color w:val="000000" w:themeColor="text1"/>
-                <w:sz w:val="19"/>
+                <w:sz w:val="26"/>
+                <w:szCs w:val="26"/>
               </w:rPr>
               <w:t>0.1395</w:t>
             </w:r>
@@ -3351,6 +3818,8 @@
               <w:rPr>
                 <w:bCs/>
                 <w:color w:val="000000" w:themeColor="text1"/>
+                <w:sz w:val="26"/>
+                <w:szCs w:val="26"/>
               </w:rPr>
             </w:pPr>
             <w:r>
@@ -3358,7 +3827,8 @@
                 <w:rFonts w:ascii="Times New Roman" w:hAnsi="Times New Roman"/>
                 <w:bCs/>
                 <w:color w:val="000000" w:themeColor="text1"/>
-                <w:sz w:val="19"/>
+                <w:sz w:val="26"/>
+                <w:szCs w:val="26"/>
               </w:rPr>
               <w:t>0.1400</w:t>
             </w:r>
@@ -3381,6 +3851,8 @@
               <w:rPr>
                 <w:bCs/>
                 <w:color w:val="000000" w:themeColor="text1"/>
+                <w:sz w:val="26"/>
+                <w:szCs w:val="26"/>
               </w:rPr>
             </w:pPr>
             <w:r>
@@ -3388,7 +3860,8 @@
                 <w:rFonts w:ascii="Times New Roman" w:hAnsi="Times New Roman"/>
                 <w:bCs/>
                 <w:color w:val="000000" w:themeColor="text1"/>
-                <w:sz w:val="19"/>
+                <w:sz w:val="26"/>
+                <w:szCs w:val="26"/>
               </w:rPr>
               <w:t>+0.0005</w:t>
             </w:r>
@@ -3410,6 +3883,8 @@
               <w:rPr>
                 <w:bCs/>
                 <w:color w:val="000000" w:themeColor="text1"/>
+                <w:sz w:val="26"/>
+                <w:szCs w:val="26"/>
               </w:rPr>
             </w:pPr>
             <w:r>
@@ -3417,7 +3892,8 @@
                 <w:rFonts w:ascii="Times New Roman" w:hAnsi="Times New Roman"/>
                 <w:bCs/>
                 <w:color w:val="000000" w:themeColor="text1"/>
-                <w:sz w:val="19"/>
+                <w:sz w:val="26"/>
+                <w:szCs w:val="26"/>
               </w:rPr>
               <w:t>Gần như không đổi (ổn định)</w:t>
             </w:r>
@@ -3444,6 +3920,8 @@
               <w:rPr>
                 <w:bCs/>
                 <w:color w:val="000000" w:themeColor="text1"/>
+                <w:sz w:val="26"/>
+                <w:szCs w:val="26"/>
               </w:rPr>
             </w:pPr>
             <w:r>
@@ -3451,7 +3929,8 @@
                 <w:rFonts w:ascii="Times New Roman" w:hAnsi="Times New Roman"/>
                 <w:bCs/>
                 <w:color w:val="000000" w:themeColor="text1"/>
-                <w:sz w:val="19"/>
+                <w:sz w:val="26"/>
+                <w:szCs w:val="26"/>
               </w:rPr>
               <w:t>PyTorch MLP (Raw)</w:t>
             </w:r>
@@ -3474,6 +3953,8 @@
               <w:rPr>
                 <w:bCs/>
                 <w:color w:val="000000" w:themeColor="text1"/>
+                <w:sz w:val="26"/>
+                <w:szCs w:val="26"/>
               </w:rPr>
             </w:pPr>
             <w:r>
@@ -3481,7 +3962,8 @@
                 <w:rFonts w:ascii="Times New Roman" w:hAnsi="Times New Roman"/>
                 <w:bCs/>
                 <w:color w:val="000000" w:themeColor="text1"/>
-                <w:sz w:val="19"/>
+                <w:sz w:val="26"/>
+                <w:szCs w:val="26"/>
               </w:rPr>
               <w:t>0.2732</w:t>
             </w:r>
@@ -3504,6 +3986,8 @@
               <w:rPr>
                 <w:bCs/>
                 <w:color w:val="000000" w:themeColor="text1"/>
+                <w:sz w:val="26"/>
+                <w:szCs w:val="26"/>
               </w:rPr>
             </w:pPr>
             <w:r>
@@ -3511,7 +3995,8 @@
                 <w:rFonts w:ascii="Times New Roman" w:hAnsi="Times New Roman"/>
                 <w:bCs/>
                 <w:color w:val="000000" w:themeColor="text1"/>
-                <w:sz w:val="19"/>
+                <w:sz w:val="26"/>
+                <w:szCs w:val="26"/>
               </w:rPr>
               <w:t>0.3588</w:t>
             </w:r>
@@ -3534,6 +4019,8 @@
               <w:rPr>
                 <w:bCs/>
                 <w:color w:val="000000" w:themeColor="text1"/>
+                <w:sz w:val="26"/>
+                <w:szCs w:val="26"/>
               </w:rPr>
             </w:pPr>
             <w:r>
@@ -3541,7 +4028,8 @@
                 <w:rFonts w:ascii="Times New Roman" w:hAnsi="Times New Roman"/>
                 <w:bCs/>
                 <w:color w:val="000000" w:themeColor="text1"/>
-                <w:sz w:val="19"/>
+                <w:sz w:val="26"/>
+                <w:szCs w:val="26"/>
               </w:rPr>
               <w:t>+0.0856</w:t>
             </w:r>
@@ -3563,6 +4051,8 @@
               <w:rPr>
                 <w:bCs/>
                 <w:color w:val="000000" w:themeColor="text1"/>
+                <w:sz w:val="26"/>
+                <w:szCs w:val="26"/>
               </w:rPr>
             </w:pPr>
             <w:r>
@@ -3570,9 +4060,20 @@
                 <w:rFonts w:ascii="Times New Roman" w:hAnsi="Times New Roman"/>
                 <w:bCs/>
                 <w:color w:val="000000" w:themeColor="text1"/>
-                <w:sz w:val="19"/>
-              </w:rPr>
-              <w:t>HIỆU SUẤT GIẢM (Xấu đi)</w:t>
+                <w:sz w:val="26"/>
+                <w:szCs w:val="26"/>
+              </w:rPr>
+              <w:t>H</w:t>
+            </w:r>
+            <w:r>
+              <w:rPr>
+                <w:rFonts w:ascii="Times New Roman" w:hAnsi="Times New Roman"/>
+                <w:bCs/>
+                <w:color w:val="000000" w:themeColor="text1"/>
+                <w:sz w:val="26"/>
+                <w:szCs w:val="26"/>
+              </w:rPr>
+              <w:t>iệu suất giảm</w:t>
             </w:r>
           </w:p>
         </w:tc>
@@ -3597,6 +4098,8 @@
               <w:rPr>
                 <w:bCs/>
                 <w:color w:val="000000" w:themeColor="text1"/>
+                <w:sz w:val="26"/>
+                <w:szCs w:val="26"/>
               </w:rPr>
             </w:pPr>
             <w:r>
@@ -3604,7 +4107,8 @@
                 <w:rFonts w:ascii="Times New Roman" w:hAnsi="Times New Roman"/>
                 <w:bCs/>
                 <w:color w:val="000000" w:themeColor="text1"/>
-                <w:sz w:val="19"/>
+                <w:sz w:val="26"/>
+                <w:szCs w:val="26"/>
               </w:rPr>
               <w:t>PyTorch MLP (Tuned - C)</w:t>
             </w:r>
@@ -3627,6 +4131,8 @@
               <w:rPr>
                 <w:bCs/>
                 <w:color w:val="000000" w:themeColor="text1"/>
+                <w:sz w:val="26"/>
+                <w:szCs w:val="26"/>
               </w:rPr>
             </w:pPr>
             <w:r>
@@ -3634,7 +4140,8 @@
                 <w:rFonts w:ascii="Times New Roman" w:hAnsi="Times New Roman"/>
                 <w:bCs/>
                 <w:color w:val="000000" w:themeColor="text1"/>
-                <w:sz w:val="19"/>
+                <w:sz w:val="26"/>
+                <w:szCs w:val="26"/>
               </w:rPr>
               <w:t>0.1252</w:t>
             </w:r>
@@ -3657,6 +4164,8 @@
               <w:rPr>
                 <w:bCs/>
                 <w:color w:val="000000" w:themeColor="text1"/>
+                <w:sz w:val="26"/>
+                <w:szCs w:val="26"/>
               </w:rPr>
             </w:pPr>
             <w:r>
@@ -3664,9 +4173,10 @@
                 <w:rFonts w:ascii="Times New Roman" w:hAnsi="Times New Roman"/>
                 <w:bCs/>
                 <w:color w:val="000000" w:themeColor="text1"/>
-                <w:sz w:val="19"/>
-              </w:rPr>
-              <w:t>0.5332</w:t>
+                <w:sz w:val="26"/>
+                <w:szCs w:val="26"/>
+              </w:rPr>
+              <w:t>0.1415</w:t>
             </w:r>
           </w:p>
         </w:tc>
@@ -3687,6 +4197,8 @@
               <w:rPr>
                 <w:bCs/>
                 <w:color w:val="000000" w:themeColor="text1"/>
+                <w:sz w:val="26"/>
+                <w:szCs w:val="26"/>
               </w:rPr>
             </w:pPr>
             <w:r>
@@ -3694,9 +4206,10 @@
                 <w:rFonts w:ascii="Times New Roman" w:hAnsi="Times New Roman"/>
                 <w:bCs/>
                 <w:color w:val="000000" w:themeColor="text1"/>
-                <w:sz w:val="19"/>
-              </w:rPr>
-              <w:t>+0.4080</w:t>
+                <w:sz w:val="26"/>
+                <w:szCs w:val="26"/>
+              </w:rPr>
+              <w:t>+0.0163</w:t>
             </w:r>
           </w:p>
         </w:tc>
@@ -3716,6 +4229,8 @@
               <w:rPr>
                 <w:bCs/>
                 <w:color w:val="000000" w:themeColor="text1"/>
+                <w:sz w:val="26"/>
+                <w:szCs w:val="26"/>
               </w:rPr>
             </w:pPr>
             <w:r>
@@ -3723,9 +4238,20 @@
                 <w:rFonts w:ascii="Times New Roman" w:hAnsi="Times New Roman"/>
                 <w:bCs/>
                 <w:color w:val="000000" w:themeColor="text1"/>
-                <w:sz w:val="19"/>
-              </w:rPr>
-              <w:t>HIỆU SUẤT GIẢM MẠNH</w:t>
+                <w:sz w:val="26"/>
+                <w:szCs w:val="26"/>
+              </w:rPr>
+              <w:t>H</w:t>
+            </w:r>
+            <w:r>
+              <w:rPr>
+                <w:rFonts w:ascii="Times New Roman" w:hAnsi="Times New Roman"/>
+                <w:bCs/>
+                <w:color w:val="000000" w:themeColor="text1"/>
+                <w:sz w:val="26"/>
+                <w:szCs w:val="26"/>
+              </w:rPr>
+              <w:t>iệu suất giảm</w:t>
             </w:r>
           </w:p>
         </w:tc>
@@ -3745,7 +4271,52 @@
           <w:color w:val="000000" w:themeColor="text1"/>
           <w:sz w:val="30"/>
         </w:rPr>
-        <w:t>6. TỔNG HỢP SO SÁNH SKLEARN VS PYTORCH &amp; KẾT QUẢ KAGGLE</w:t>
+        <w:t xml:space="preserve">6. </w:t>
+      </w:r>
+      <w:r>
+        <w:rPr>
+          <w:rFonts w:ascii="Times New Roman" w:hAnsi="Times New Roman"/>
+          <w:b/>
+          <w:color w:val="000000" w:themeColor="text1"/>
+          <w:sz w:val="30"/>
+        </w:rPr>
+        <w:t>So sánh</w:t>
+      </w:r>
+      <w:r>
+        <w:rPr>
+          <w:rFonts w:ascii="Times New Roman" w:hAnsi="Times New Roman"/>
+          <w:b/>
+          <w:color w:val="000000" w:themeColor="text1"/>
+          <w:sz w:val="30"/>
+        </w:rPr>
+        <w:t xml:space="preserve"> </w:t>
+      </w:r>
+      <w:r>
+        <w:rPr>
+          <w:rFonts w:ascii="Times New Roman" w:hAnsi="Times New Roman"/>
+          <w:b/>
+          <w:color w:val="000000" w:themeColor="text1"/>
+          <w:sz w:val="30"/>
+        </w:rPr>
+        <w:t>sklearn với</w:t>
+      </w:r>
+      <w:r>
+        <w:rPr>
+          <w:rFonts w:ascii="Times New Roman" w:hAnsi="Times New Roman"/>
+          <w:b/>
+          <w:color w:val="000000" w:themeColor="text1"/>
+          <w:sz w:val="30"/>
+        </w:rPr>
+        <w:t xml:space="preserve"> </w:t>
+      </w:r>
+      <w:r>
+        <w:rPr>
+          <w:rFonts w:ascii="Times New Roman" w:hAnsi="Times New Roman"/>
+          <w:b/>
+          <w:color w:val="000000" w:themeColor="text1"/>
+          <w:sz w:val="30"/>
+        </w:rPr>
+        <w:t xml:space="preserve">với pytorch </w:t>
       </w:r>
     </w:p>
     <w:tbl>
@@ -3763,11 +4334,11 @@
         <w:tblLook w:val="04A0" w:firstRow="1" w:lastRow="0" w:firstColumn="1" w:lastColumn="0" w:noHBand="0" w:noVBand="1"/>
       </w:tblPr>
       <w:tblGrid>
-        <w:gridCol w:w="1582"/>
-        <w:gridCol w:w="2891"/>
-        <w:gridCol w:w="1081"/>
-        <w:gridCol w:w="1067"/>
-        <w:gridCol w:w="1448"/>
+        <w:gridCol w:w="1576"/>
+        <w:gridCol w:w="2887"/>
+        <w:gridCol w:w="1091"/>
+        <w:gridCol w:w="1084"/>
+        <w:gridCol w:w="1431"/>
         <w:gridCol w:w="1451"/>
       </w:tblGrid>
       <w:tr>
@@ -3789,15 +4360,19 @@
             <w:pPr>
               <w:jc w:val="center"/>
               <w:rPr>
-                <w:color w:val="000000" w:themeColor="text1"/>
+                <w:bCs/>
+                <w:color w:val="000000" w:themeColor="text1"/>
+                <w:sz w:val="26"/>
+                <w:szCs w:val="26"/>
               </w:rPr>
             </w:pPr>
             <w:r>
               <w:rPr>
                 <w:rFonts w:ascii="Times New Roman" w:hAnsi="Times New Roman"/>
-                <w:b/>
-                <w:color w:val="000000" w:themeColor="text1"/>
-                <w:sz w:val="18"/>
+                <w:bCs/>
+                <w:color w:val="000000" w:themeColor="text1"/>
+                <w:sz w:val="26"/>
+                <w:szCs w:val="26"/>
               </w:rPr>
               <w:t>Nhóm</w:t>
             </w:r>
@@ -3818,15 +4393,19 @@
             <w:pPr>
               <w:jc w:val="center"/>
               <w:rPr>
-                <w:color w:val="000000" w:themeColor="text1"/>
+                <w:bCs/>
+                <w:color w:val="000000" w:themeColor="text1"/>
+                <w:sz w:val="26"/>
+                <w:szCs w:val="26"/>
               </w:rPr>
             </w:pPr>
             <w:r>
               <w:rPr>
                 <w:rFonts w:ascii="Times New Roman" w:hAnsi="Times New Roman"/>
-                <w:b/>
-                <w:color w:val="000000" w:themeColor="text1"/>
-                <w:sz w:val="18"/>
+                <w:bCs/>
+                <w:color w:val="000000" w:themeColor="text1"/>
+                <w:sz w:val="26"/>
+                <w:szCs w:val="26"/>
               </w:rPr>
               <w:t>Mô hình / Cấu hình</w:t>
             </w:r>
@@ -3847,15 +4426,19 @@
             <w:pPr>
               <w:jc w:val="center"/>
               <w:rPr>
-                <w:color w:val="000000" w:themeColor="text1"/>
+                <w:bCs/>
+                <w:color w:val="000000" w:themeColor="text1"/>
+                <w:sz w:val="26"/>
+                <w:szCs w:val="26"/>
               </w:rPr>
             </w:pPr>
             <w:r>
               <w:rPr>
                 <w:rFonts w:ascii="Times New Roman" w:hAnsi="Times New Roman"/>
-                <w:b/>
-                <w:color w:val="000000" w:themeColor="text1"/>
-                <w:sz w:val="18"/>
+                <w:bCs/>
+                <w:color w:val="000000" w:themeColor="text1"/>
+                <w:sz w:val="26"/>
+                <w:szCs w:val="26"/>
               </w:rPr>
               <w:t>Val RMSE</w:t>
             </w:r>
@@ -3876,15 +4459,19 @@
             <w:pPr>
               <w:jc w:val="center"/>
               <w:rPr>
-                <w:color w:val="000000" w:themeColor="text1"/>
+                <w:bCs/>
+                <w:color w:val="000000" w:themeColor="text1"/>
+                <w:sz w:val="26"/>
+                <w:szCs w:val="26"/>
               </w:rPr>
             </w:pPr>
             <w:r>
               <w:rPr>
                 <w:rFonts w:ascii="Times New Roman" w:hAnsi="Times New Roman"/>
-                <w:b/>
-                <w:color w:val="000000" w:themeColor="text1"/>
-                <w:sz w:val="18"/>
+                <w:bCs/>
+                <w:color w:val="000000" w:themeColor="text1"/>
+                <w:sz w:val="26"/>
+                <w:szCs w:val="26"/>
               </w:rPr>
               <w:t>Val R²</w:t>
             </w:r>
@@ -3905,15 +4492,19 @@
             <w:pPr>
               <w:jc w:val="center"/>
               <w:rPr>
-                <w:color w:val="000000" w:themeColor="text1"/>
+                <w:bCs/>
+                <w:color w:val="000000" w:themeColor="text1"/>
+                <w:sz w:val="26"/>
+                <w:szCs w:val="26"/>
               </w:rPr>
             </w:pPr>
             <w:r>
               <w:rPr>
                 <w:rFonts w:ascii="Times New Roman" w:hAnsi="Times New Roman"/>
-                <w:b/>
-                <w:color w:val="000000" w:themeColor="text1"/>
-                <w:sz w:val="18"/>
+                <w:bCs/>
+                <w:color w:val="000000" w:themeColor="text1"/>
+                <w:sz w:val="26"/>
+                <w:szCs w:val="26"/>
               </w:rPr>
               <w:t>CV5 RMSE</w:t>
             </w:r>
@@ -3934,15 +4525,19 @@
             <w:pPr>
               <w:jc w:val="center"/>
               <w:rPr>
-                <w:color w:val="000000" w:themeColor="text1"/>
+                <w:bCs/>
+                <w:color w:val="000000" w:themeColor="text1"/>
+                <w:sz w:val="26"/>
+                <w:szCs w:val="26"/>
               </w:rPr>
             </w:pPr>
             <w:r>
               <w:rPr>
                 <w:rFonts w:ascii="Times New Roman" w:hAnsi="Times New Roman"/>
-                <w:b/>
-                <w:color w:val="000000" w:themeColor="text1"/>
-                <w:sz w:val="18"/>
+                <w:bCs/>
+                <w:color w:val="000000" w:themeColor="text1"/>
+                <w:sz w:val="26"/>
+                <w:szCs w:val="26"/>
               </w:rPr>
               <w:t>Kaggle Score</w:t>
             </w:r>
@@ -3968,14 +4563,19 @@
             <w:pPr>
               <w:jc w:val="center"/>
               <w:rPr>
-                <w:color w:val="000000" w:themeColor="text1"/>
+                <w:bCs/>
+                <w:color w:val="000000" w:themeColor="text1"/>
+                <w:sz w:val="26"/>
+                <w:szCs w:val="26"/>
               </w:rPr>
             </w:pPr>
             <w:r>
               <w:rPr>
                 <w:rFonts w:ascii="Times New Roman" w:hAnsi="Times New Roman"/>
-                <w:color w:val="000000" w:themeColor="text1"/>
-                <w:sz w:val="17"/>
+                <w:bCs/>
+                <w:color w:val="000000" w:themeColor="text1"/>
+                <w:sz w:val="26"/>
+                <w:szCs w:val="26"/>
               </w:rPr>
               <w:t>Sklearn</w:t>
             </w:r>
@@ -3995,14 +4595,19 @@
           <w:p>
             <w:pPr>
               <w:rPr>
-                <w:color w:val="000000" w:themeColor="text1"/>
+                <w:bCs/>
+                <w:color w:val="000000" w:themeColor="text1"/>
+                <w:sz w:val="26"/>
+                <w:szCs w:val="26"/>
               </w:rPr>
             </w:pPr>
             <w:r>
               <w:rPr>
                 <w:rFonts w:ascii="Times New Roman" w:hAnsi="Times New Roman"/>
-                <w:color w:val="000000" w:themeColor="text1"/>
-                <w:sz w:val="17"/>
+                <w:bCs/>
+                <w:color w:val="000000" w:themeColor="text1"/>
+                <w:sz w:val="26"/>
+                <w:szCs w:val="26"/>
               </w:rPr>
               <w:t>Linear Regression</w:t>
             </w:r>
@@ -4023,14 +4628,19 @@
             <w:pPr>
               <w:jc w:val="center"/>
               <w:rPr>
-                <w:color w:val="000000" w:themeColor="text1"/>
+                <w:bCs/>
+                <w:color w:val="000000" w:themeColor="text1"/>
+                <w:sz w:val="26"/>
+                <w:szCs w:val="26"/>
               </w:rPr>
             </w:pPr>
             <w:r>
               <w:rPr>
                 <w:rFonts w:ascii="Times New Roman" w:hAnsi="Times New Roman"/>
-                <w:color w:val="000000" w:themeColor="text1"/>
-                <w:sz w:val="17"/>
+                <w:bCs/>
+                <w:color w:val="000000" w:themeColor="text1"/>
+                <w:sz w:val="26"/>
+                <w:szCs w:val="26"/>
               </w:rPr>
               <w:t>0.1220</w:t>
             </w:r>
@@ -4051,14 +4661,19 @@
             <w:pPr>
               <w:jc w:val="center"/>
               <w:rPr>
-                <w:color w:val="000000" w:themeColor="text1"/>
+                <w:bCs/>
+                <w:color w:val="000000" w:themeColor="text1"/>
+                <w:sz w:val="26"/>
+                <w:szCs w:val="26"/>
               </w:rPr>
             </w:pPr>
             <w:r>
               <w:rPr>
                 <w:rFonts w:ascii="Times New Roman" w:hAnsi="Times New Roman"/>
-                <w:color w:val="000000" w:themeColor="text1"/>
-                <w:sz w:val="17"/>
+                <w:bCs/>
+                <w:color w:val="000000" w:themeColor="text1"/>
+                <w:sz w:val="26"/>
+                <w:szCs w:val="26"/>
               </w:rPr>
               <w:t>0.9202</w:t>
             </w:r>
@@ -4079,14 +4694,19 @@
             <w:pPr>
               <w:jc w:val="center"/>
               <w:rPr>
-                <w:color w:val="000000" w:themeColor="text1"/>
+                <w:bCs/>
+                <w:color w:val="000000" w:themeColor="text1"/>
+                <w:sz w:val="26"/>
+                <w:szCs w:val="26"/>
               </w:rPr>
             </w:pPr>
             <w:r>
               <w:rPr>
                 <w:rFonts w:ascii="Times New Roman" w:hAnsi="Times New Roman"/>
-                <w:color w:val="000000" w:themeColor="text1"/>
-                <w:sz w:val="17"/>
+                <w:bCs/>
+                <w:color w:val="000000" w:themeColor="text1"/>
+                <w:sz w:val="26"/>
+                <w:szCs w:val="26"/>
               </w:rPr>
               <w:t>–</w:t>
             </w:r>
@@ -4107,14 +4727,19 @@
             <w:pPr>
               <w:jc w:val="center"/>
               <w:rPr>
-                <w:color w:val="000000" w:themeColor="text1"/>
+                <w:bCs/>
+                <w:color w:val="000000" w:themeColor="text1"/>
+                <w:sz w:val="26"/>
+                <w:szCs w:val="26"/>
               </w:rPr>
             </w:pPr>
             <w:r>
               <w:rPr>
                 <w:rFonts w:ascii="Times New Roman" w:hAnsi="Times New Roman"/>
-                <w:color w:val="000000" w:themeColor="text1"/>
-                <w:sz w:val="17"/>
+                <w:bCs/>
+                <w:color w:val="000000" w:themeColor="text1"/>
+                <w:sz w:val="26"/>
+                <w:szCs w:val="26"/>
               </w:rPr>
               <w:t>–</w:t>
             </w:r>
@@ -4140,14 +4765,19 @@
             <w:pPr>
               <w:jc w:val="center"/>
               <w:rPr>
-                <w:color w:val="000000" w:themeColor="text1"/>
+                <w:bCs/>
+                <w:color w:val="000000" w:themeColor="text1"/>
+                <w:sz w:val="26"/>
+                <w:szCs w:val="26"/>
               </w:rPr>
             </w:pPr>
             <w:r>
               <w:rPr>
                 <w:rFonts w:ascii="Times New Roman" w:hAnsi="Times New Roman"/>
-                <w:color w:val="000000" w:themeColor="text1"/>
-                <w:sz w:val="17"/>
+                <w:bCs/>
+                <w:color w:val="000000" w:themeColor="text1"/>
+                <w:sz w:val="26"/>
+                <w:szCs w:val="26"/>
               </w:rPr>
               <w:t>Sklearn</w:t>
             </w:r>
@@ -4167,14 +4797,19 @@
           <w:p>
             <w:pPr>
               <w:rPr>
-                <w:color w:val="000000" w:themeColor="text1"/>
+                <w:bCs/>
+                <w:color w:val="000000" w:themeColor="text1"/>
+                <w:sz w:val="26"/>
+                <w:szCs w:val="26"/>
               </w:rPr>
             </w:pPr>
             <w:r>
               <w:rPr>
                 <w:rFonts w:ascii="Times New Roman" w:hAnsi="Times New Roman"/>
-                <w:color w:val="000000" w:themeColor="text1"/>
-                <w:sz w:val="17"/>
+                <w:bCs/>
+                <w:color w:val="000000" w:themeColor="text1"/>
+                <w:sz w:val="26"/>
+                <w:szCs w:val="26"/>
               </w:rPr>
               <w:t>Ridge Regression (alpha=10)</w:t>
             </w:r>
@@ -4195,14 +4830,19 @@
             <w:pPr>
               <w:jc w:val="center"/>
               <w:rPr>
-                <w:color w:val="000000" w:themeColor="text1"/>
+                <w:bCs/>
+                <w:color w:val="000000" w:themeColor="text1"/>
+                <w:sz w:val="26"/>
+                <w:szCs w:val="26"/>
               </w:rPr>
             </w:pPr>
             <w:r>
               <w:rPr>
                 <w:rFonts w:ascii="Times New Roman" w:hAnsi="Times New Roman"/>
-                <w:color w:val="000000" w:themeColor="text1"/>
-                <w:sz w:val="17"/>
+                <w:bCs/>
+                <w:color w:val="000000" w:themeColor="text1"/>
+                <w:sz w:val="26"/>
+                <w:szCs w:val="26"/>
               </w:rPr>
               <w:t>0.1218</w:t>
             </w:r>
@@ -4223,14 +4863,19 @@
             <w:pPr>
               <w:jc w:val="center"/>
               <w:rPr>
-                <w:color w:val="000000" w:themeColor="text1"/>
+                <w:bCs/>
+                <w:color w:val="000000" w:themeColor="text1"/>
+                <w:sz w:val="26"/>
+                <w:szCs w:val="26"/>
               </w:rPr>
             </w:pPr>
             <w:r>
               <w:rPr>
                 <w:rFonts w:ascii="Times New Roman" w:hAnsi="Times New Roman"/>
-                <w:color w:val="000000" w:themeColor="text1"/>
-                <w:sz w:val="17"/>
+                <w:bCs/>
+                <w:color w:val="000000" w:themeColor="text1"/>
+                <w:sz w:val="26"/>
+                <w:szCs w:val="26"/>
               </w:rPr>
               <w:t>0.9205</w:t>
             </w:r>
@@ -4251,14 +4896,19 @@
             <w:pPr>
               <w:jc w:val="center"/>
               <w:rPr>
-                <w:color w:val="000000" w:themeColor="text1"/>
+                <w:bCs/>
+                <w:color w:val="000000" w:themeColor="text1"/>
+                <w:sz w:val="26"/>
+                <w:szCs w:val="26"/>
               </w:rPr>
             </w:pPr>
             <w:r>
               <w:rPr>
                 <w:rFonts w:ascii="Times New Roman" w:hAnsi="Times New Roman"/>
-                <w:color w:val="000000" w:themeColor="text1"/>
-                <w:sz w:val="17"/>
+                <w:bCs/>
+                <w:color w:val="000000" w:themeColor="text1"/>
+                <w:sz w:val="26"/>
+                <w:szCs w:val="26"/>
               </w:rPr>
               <w:t>–</w:t>
             </w:r>
@@ -4279,14 +4929,19 @@
             <w:pPr>
               <w:jc w:val="center"/>
               <w:rPr>
-                <w:color w:val="000000" w:themeColor="text1"/>
+                <w:bCs/>
+                <w:color w:val="000000" w:themeColor="text1"/>
+                <w:sz w:val="26"/>
+                <w:szCs w:val="26"/>
               </w:rPr>
             </w:pPr>
             <w:r>
               <w:rPr>
                 <w:rFonts w:ascii="Times New Roman" w:hAnsi="Times New Roman"/>
-                <w:color w:val="000000" w:themeColor="text1"/>
-                <w:sz w:val="17"/>
+                <w:bCs/>
+                <w:color w:val="000000" w:themeColor="text1"/>
+                <w:sz w:val="26"/>
+                <w:szCs w:val="26"/>
               </w:rPr>
               <w:t>–</w:t>
             </w:r>
@@ -4312,14 +4967,19 @@
             <w:pPr>
               <w:jc w:val="center"/>
               <w:rPr>
-                <w:color w:val="000000" w:themeColor="text1"/>
+                <w:bCs/>
+                <w:color w:val="000000" w:themeColor="text1"/>
+                <w:sz w:val="26"/>
+                <w:szCs w:val="26"/>
               </w:rPr>
             </w:pPr>
             <w:r>
               <w:rPr>
                 <w:rFonts w:ascii="Times New Roman" w:hAnsi="Times New Roman"/>
-                <w:color w:val="000000" w:themeColor="text1"/>
-                <w:sz w:val="17"/>
+                <w:bCs/>
+                <w:color w:val="000000" w:themeColor="text1"/>
+                <w:sz w:val="26"/>
+                <w:szCs w:val="26"/>
               </w:rPr>
               <w:t>Sklearn</w:t>
             </w:r>
@@ -4339,14 +4999,19 @@
           <w:p>
             <w:pPr>
               <w:rPr>
-                <w:color w:val="000000" w:themeColor="text1"/>
+                <w:bCs/>
+                <w:color w:val="000000" w:themeColor="text1"/>
+                <w:sz w:val="26"/>
+                <w:szCs w:val="26"/>
               </w:rPr>
             </w:pPr>
             <w:r>
               <w:rPr>
                 <w:rFonts w:ascii="Times New Roman" w:hAnsi="Times New Roman"/>
-                <w:color w:val="000000" w:themeColor="text1"/>
-                <w:sz w:val="17"/>
+                <w:bCs/>
+                <w:color w:val="000000" w:themeColor="text1"/>
+                <w:sz w:val="26"/>
+                <w:szCs w:val="26"/>
               </w:rPr>
               <w:t>Lasso (alpha=0.001)</w:t>
             </w:r>
@@ -4367,14 +5032,19 @@
             <w:pPr>
               <w:jc w:val="center"/>
               <w:rPr>
-                <w:color w:val="000000" w:themeColor="text1"/>
+                <w:bCs/>
+                <w:color w:val="000000" w:themeColor="text1"/>
+                <w:sz w:val="26"/>
+                <w:szCs w:val="26"/>
               </w:rPr>
             </w:pPr>
             <w:r>
               <w:rPr>
                 <w:rFonts w:ascii="Times New Roman" w:hAnsi="Times New Roman"/>
-                <w:color w:val="000000" w:themeColor="text1"/>
-                <w:sz w:val="17"/>
+                <w:bCs/>
+                <w:color w:val="000000" w:themeColor="text1"/>
+                <w:sz w:val="26"/>
+                <w:szCs w:val="26"/>
               </w:rPr>
               <w:t>0.1194</w:t>
             </w:r>
@@ -4395,14 +5065,19 @@
             <w:pPr>
               <w:jc w:val="center"/>
               <w:rPr>
-                <w:color w:val="000000" w:themeColor="text1"/>
+                <w:bCs/>
+                <w:color w:val="000000" w:themeColor="text1"/>
+                <w:sz w:val="26"/>
+                <w:szCs w:val="26"/>
               </w:rPr>
             </w:pPr>
             <w:r>
               <w:rPr>
                 <w:rFonts w:ascii="Times New Roman" w:hAnsi="Times New Roman"/>
-                <w:color w:val="000000" w:themeColor="text1"/>
-                <w:sz w:val="17"/>
+                <w:bCs/>
+                <w:color w:val="000000" w:themeColor="text1"/>
+                <w:sz w:val="26"/>
+                <w:szCs w:val="26"/>
               </w:rPr>
               <w:t>0.9236</w:t>
             </w:r>
@@ -4423,14 +5098,19 @@
             <w:pPr>
               <w:jc w:val="center"/>
               <w:rPr>
-                <w:color w:val="000000" w:themeColor="text1"/>
+                <w:bCs/>
+                <w:color w:val="000000" w:themeColor="text1"/>
+                <w:sz w:val="26"/>
+                <w:szCs w:val="26"/>
               </w:rPr>
             </w:pPr>
             <w:r>
               <w:rPr>
                 <w:rFonts w:ascii="Times New Roman" w:hAnsi="Times New Roman"/>
-                <w:color w:val="000000" w:themeColor="text1"/>
-                <w:sz w:val="17"/>
+                <w:bCs/>
+                <w:color w:val="000000" w:themeColor="text1"/>
+                <w:sz w:val="26"/>
+                <w:szCs w:val="26"/>
               </w:rPr>
               <w:t>–</w:t>
             </w:r>
@@ -4451,14 +5131,19 @@
             <w:pPr>
               <w:jc w:val="center"/>
               <w:rPr>
-                <w:color w:val="000000" w:themeColor="text1"/>
+                <w:bCs/>
+                <w:color w:val="000000" w:themeColor="text1"/>
+                <w:sz w:val="26"/>
+                <w:szCs w:val="26"/>
               </w:rPr>
             </w:pPr>
             <w:r>
               <w:rPr>
                 <w:rFonts w:ascii="Times New Roman" w:hAnsi="Times New Roman"/>
-                <w:color w:val="000000" w:themeColor="text1"/>
-                <w:sz w:val="17"/>
+                <w:bCs/>
+                <w:color w:val="000000" w:themeColor="text1"/>
+                <w:sz w:val="26"/>
+                <w:szCs w:val="26"/>
               </w:rPr>
               <w:t>–</w:t>
             </w:r>
@@ -4484,14 +5169,19 @@
             <w:pPr>
               <w:jc w:val="center"/>
               <w:rPr>
-                <w:color w:val="000000" w:themeColor="text1"/>
+                <w:bCs/>
+                <w:color w:val="000000" w:themeColor="text1"/>
+                <w:sz w:val="26"/>
+                <w:szCs w:val="26"/>
               </w:rPr>
             </w:pPr>
             <w:r>
               <w:rPr>
                 <w:rFonts w:ascii="Times New Roman" w:hAnsi="Times New Roman"/>
-                <w:color w:val="000000" w:themeColor="text1"/>
-                <w:sz w:val="17"/>
+                <w:bCs/>
+                <w:color w:val="000000" w:themeColor="text1"/>
+                <w:sz w:val="26"/>
+                <w:szCs w:val="26"/>
               </w:rPr>
               <w:t>Sklearn</w:t>
             </w:r>
@@ -4511,14 +5201,19 @@
           <w:p>
             <w:pPr>
               <w:rPr>
-                <w:color w:val="000000" w:themeColor="text1"/>
+                <w:bCs/>
+                <w:color w:val="000000" w:themeColor="text1"/>
+                <w:sz w:val="26"/>
+                <w:szCs w:val="26"/>
               </w:rPr>
             </w:pPr>
             <w:r>
               <w:rPr>
                 <w:rFonts w:ascii="Times New Roman" w:hAnsi="Times New Roman"/>
-                <w:color w:val="000000" w:themeColor="text1"/>
-                <w:sz w:val="17"/>
+                <w:bCs/>
+                <w:color w:val="000000" w:themeColor="text1"/>
+                <w:sz w:val="26"/>
+                <w:szCs w:val="26"/>
               </w:rPr>
               <w:t>Random Forest (300)</w:t>
             </w:r>
@@ -4539,14 +5234,19 @@
             <w:pPr>
               <w:jc w:val="center"/>
               <w:rPr>
-                <w:color w:val="000000" w:themeColor="text1"/>
+                <w:bCs/>
+                <w:color w:val="000000" w:themeColor="text1"/>
+                <w:sz w:val="26"/>
+                <w:szCs w:val="26"/>
               </w:rPr>
             </w:pPr>
             <w:r>
               <w:rPr>
                 <w:rFonts w:ascii="Times New Roman" w:hAnsi="Times New Roman"/>
-                <w:color w:val="000000" w:themeColor="text1"/>
-                <w:sz w:val="17"/>
+                <w:bCs/>
+                <w:color w:val="000000" w:themeColor="text1"/>
+                <w:sz w:val="26"/>
+                <w:szCs w:val="26"/>
               </w:rPr>
               <w:t>0.1458</w:t>
             </w:r>
@@ -4567,14 +5267,19 @@
             <w:pPr>
               <w:jc w:val="center"/>
               <w:rPr>
-                <w:color w:val="000000" w:themeColor="text1"/>
+                <w:bCs/>
+                <w:color w:val="000000" w:themeColor="text1"/>
+                <w:sz w:val="26"/>
+                <w:szCs w:val="26"/>
               </w:rPr>
             </w:pPr>
             <w:r>
               <w:rPr>
                 <w:rFonts w:ascii="Times New Roman" w:hAnsi="Times New Roman"/>
-                <w:color w:val="000000" w:themeColor="text1"/>
-                <w:sz w:val="17"/>
+                <w:bCs/>
+                <w:color w:val="000000" w:themeColor="text1"/>
+                <w:sz w:val="26"/>
+                <w:szCs w:val="26"/>
               </w:rPr>
               <w:t>0.8861</w:t>
             </w:r>
@@ -4595,14 +5300,19 @@
             <w:pPr>
               <w:jc w:val="center"/>
               <w:rPr>
-                <w:color w:val="000000" w:themeColor="text1"/>
+                <w:bCs/>
+                <w:color w:val="000000" w:themeColor="text1"/>
+                <w:sz w:val="26"/>
+                <w:szCs w:val="26"/>
               </w:rPr>
             </w:pPr>
             <w:r>
               <w:rPr>
                 <w:rFonts w:ascii="Times New Roman" w:hAnsi="Times New Roman"/>
-                <w:color w:val="000000" w:themeColor="text1"/>
-                <w:sz w:val="17"/>
+                <w:bCs/>
+                <w:color w:val="000000" w:themeColor="text1"/>
+                <w:sz w:val="26"/>
+                <w:szCs w:val="26"/>
               </w:rPr>
               <w:t>–</w:t>
             </w:r>
@@ -4623,14 +5333,19 @@
             <w:pPr>
               <w:jc w:val="center"/>
               <w:rPr>
-                <w:color w:val="000000" w:themeColor="text1"/>
+                <w:bCs/>
+                <w:color w:val="000000" w:themeColor="text1"/>
+                <w:sz w:val="26"/>
+                <w:szCs w:val="26"/>
               </w:rPr>
             </w:pPr>
             <w:r>
               <w:rPr>
                 <w:rFonts w:ascii="Times New Roman" w:hAnsi="Times New Roman"/>
-                <w:color w:val="000000" w:themeColor="text1"/>
-                <w:sz w:val="17"/>
+                <w:bCs/>
+                <w:color w:val="000000" w:themeColor="text1"/>
+                <w:sz w:val="26"/>
+                <w:szCs w:val="26"/>
               </w:rPr>
               <w:t>–</w:t>
             </w:r>
@@ -4656,14 +5371,19 @@
             <w:pPr>
               <w:jc w:val="center"/>
               <w:rPr>
-                <w:color w:val="000000" w:themeColor="text1"/>
+                <w:bCs/>
+                <w:color w:val="000000" w:themeColor="text1"/>
+                <w:sz w:val="26"/>
+                <w:szCs w:val="26"/>
               </w:rPr>
             </w:pPr>
             <w:r>
               <w:rPr>
                 <w:rFonts w:ascii="Times New Roman" w:hAnsi="Times New Roman"/>
-                <w:color w:val="000000" w:themeColor="text1"/>
-                <w:sz w:val="17"/>
+                <w:bCs/>
+                <w:color w:val="000000" w:themeColor="text1"/>
+                <w:sz w:val="26"/>
+                <w:szCs w:val="26"/>
               </w:rPr>
               <w:t>Sklearn</w:t>
             </w:r>
@@ -4683,14 +5403,19 @@
           <w:p>
             <w:pPr>
               <w:rPr>
-                <w:color w:val="000000" w:themeColor="text1"/>
+                <w:bCs/>
+                <w:color w:val="000000" w:themeColor="text1"/>
+                <w:sz w:val="26"/>
+                <w:szCs w:val="26"/>
               </w:rPr>
             </w:pPr>
             <w:r>
               <w:rPr>
                 <w:rFonts w:ascii="Times New Roman" w:hAnsi="Times New Roman"/>
-                <w:color w:val="000000" w:themeColor="text1"/>
-                <w:sz w:val="17"/>
+                <w:bCs/>
+                <w:color w:val="000000" w:themeColor="text1"/>
+                <w:sz w:val="26"/>
+                <w:szCs w:val="26"/>
               </w:rPr>
               <w:t>Ridge (tuned, alpha=300)</w:t>
             </w:r>
@@ -4711,14 +5436,19 @@
             <w:pPr>
               <w:jc w:val="center"/>
               <w:rPr>
-                <w:color w:val="000000" w:themeColor="text1"/>
+                <w:bCs/>
+                <w:color w:val="000000" w:themeColor="text1"/>
+                <w:sz w:val="26"/>
+                <w:szCs w:val="26"/>
               </w:rPr>
             </w:pPr>
             <w:r>
               <w:rPr>
                 <w:rFonts w:ascii="Times New Roman" w:hAnsi="Times New Roman"/>
-                <w:color w:val="000000" w:themeColor="text1"/>
-                <w:sz w:val="17"/>
+                <w:bCs/>
+                <w:color w:val="000000" w:themeColor="text1"/>
+                <w:sz w:val="26"/>
+                <w:szCs w:val="26"/>
               </w:rPr>
               <w:t>0.1245</w:t>
             </w:r>
@@ -4739,14 +5469,19 @@
             <w:pPr>
               <w:jc w:val="center"/>
               <w:rPr>
-                <w:color w:val="000000" w:themeColor="text1"/>
+                <w:bCs/>
+                <w:color w:val="000000" w:themeColor="text1"/>
+                <w:sz w:val="26"/>
+                <w:szCs w:val="26"/>
               </w:rPr>
             </w:pPr>
             <w:r>
               <w:rPr>
                 <w:rFonts w:ascii="Times New Roman" w:hAnsi="Times New Roman"/>
-                <w:color w:val="000000" w:themeColor="text1"/>
-                <w:sz w:val="17"/>
+                <w:bCs/>
+                <w:color w:val="000000" w:themeColor="text1"/>
+                <w:sz w:val="26"/>
+                <w:szCs w:val="26"/>
               </w:rPr>
               <w:t>0.9170</w:t>
             </w:r>
@@ -4767,14 +5502,19 @@
             <w:pPr>
               <w:jc w:val="center"/>
               <w:rPr>
-                <w:color w:val="000000" w:themeColor="text1"/>
+                <w:bCs/>
+                <w:color w:val="000000" w:themeColor="text1"/>
+                <w:sz w:val="26"/>
+                <w:szCs w:val="26"/>
               </w:rPr>
             </w:pPr>
             <w:r>
               <w:rPr>
                 <w:rFonts w:ascii="Times New Roman" w:hAnsi="Times New Roman"/>
-                <w:color w:val="000000" w:themeColor="text1"/>
-                <w:sz w:val="17"/>
+                <w:bCs/>
+                <w:color w:val="000000" w:themeColor="text1"/>
+                <w:sz w:val="26"/>
+                <w:szCs w:val="26"/>
               </w:rPr>
               <w:t>0.1387 ± 0.043</w:t>
             </w:r>
@@ -4795,14 +5535,19 @@
             <w:pPr>
               <w:jc w:val="center"/>
               <w:rPr>
-                <w:color w:val="000000" w:themeColor="text1"/>
+                <w:bCs/>
+                <w:color w:val="000000" w:themeColor="text1"/>
+                <w:sz w:val="26"/>
+                <w:szCs w:val="26"/>
               </w:rPr>
             </w:pPr>
             <w:r>
               <w:rPr>
                 <w:rFonts w:ascii="Times New Roman" w:hAnsi="Times New Roman"/>
-                <w:color w:val="000000" w:themeColor="text1"/>
-                <w:sz w:val="17"/>
+                <w:bCs/>
+                <w:color w:val="000000" w:themeColor="text1"/>
+                <w:sz w:val="26"/>
+                <w:szCs w:val="26"/>
               </w:rPr>
               <w:t>–</w:t>
             </w:r>
@@ -4828,14 +5573,19 @@
             <w:pPr>
               <w:jc w:val="center"/>
               <w:rPr>
-                <w:color w:val="000000" w:themeColor="text1"/>
+                <w:bCs/>
+                <w:color w:val="000000" w:themeColor="text1"/>
+                <w:sz w:val="26"/>
+                <w:szCs w:val="26"/>
               </w:rPr>
             </w:pPr>
             <w:r>
               <w:rPr>
                 <w:rFonts w:ascii="Times New Roman" w:hAnsi="Times New Roman"/>
-                <w:color w:val="000000" w:themeColor="text1"/>
-                <w:sz w:val="17"/>
+                <w:bCs/>
+                <w:color w:val="000000" w:themeColor="text1"/>
+                <w:sz w:val="26"/>
+                <w:szCs w:val="26"/>
               </w:rPr>
               <w:t>Sklearn</w:t>
             </w:r>
@@ -4855,14 +5605,19 @@
           <w:p>
             <w:pPr>
               <w:rPr>
-                <w:color w:val="000000" w:themeColor="text1"/>
+                <w:bCs/>
+                <w:color w:val="000000" w:themeColor="text1"/>
+                <w:sz w:val="26"/>
+                <w:szCs w:val="26"/>
               </w:rPr>
             </w:pPr>
             <w:r>
               <w:rPr>
                 <w:rFonts w:ascii="Times New Roman" w:hAnsi="Times New Roman"/>
-                <w:color w:val="000000" w:themeColor="text1"/>
-                <w:sz w:val="17"/>
+                <w:bCs/>
+                <w:color w:val="000000" w:themeColor="text1"/>
+                <w:sz w:val="26"/>
+                <w:szCs w:val="26"/>
               </w:rPr>
               <w:t>ElasticNet (tuned)</w:t>
             </w:r>
@@ -4883,14 +5638,19 @@
             <w:pPr>
               <w:jc w:val="center"/>
               <w:rPr>
-                <w:color w:val="000000" w:themeColor="text1"/>
+                <w:bCs/>
+                <w:color w:val="000000" w:themeColor="text1"/>
+                <w:sz w:val="26"/>
+                <w:szCs w:val="26"/>
               </w:rPr>
             </w:pPr>
             <w:r>
               <w:rPr>
                 <w:rFonts w:ascii="Times New Roman" w:hAnsi="Times New Roman"/>
-                <w:color w:val="000000" w:themeColor="text1"/>
-                <w:sz w:val="17"/>
+                <w:bCs/>
+                <w:color w:val="000000" w:themeColor="text1"/>
+                <w:sz w:val="26"/>
+                <w:szCs w:val="26"/>
               </w:rPr>
               <w:t>0.1193</w:t>
             </w:r>
@@ -4911,14 +5671,19 @@
             <w:pPr>
               <w:jc w:val="center"/>
               <w:rPr>
-                <w:color w:val="000000" w:themeColor="text1"/>
+                <w:bCs/>
+                <w:color w:val="000000" w:themeColor="text1"/>
+                <w:sz w:val="26"/>
+                <w:szCs w:val="26"/>
               </w:rPr>
             </w:pPr>
             <w:r>
               <w:rPr>
                 <w:rFonts w:ascii="Times New Roman" w:hAnsi="Times New Roman"/>
-                <w:color w:val="000000" w:themeColor="text1"/>
-                <w:sz w:val="17"/>
+                <w:bCs/>
+                <w:color w:val="000000" w:themeColor="text1"/>
+                <w:sz w:val="26"/>
+                <w:szCs w:val="26"/>
               </w:rPr>
               <w:t>0.9238</w:t>
             </w:r>
@@ -4939,14 +5704,19 @@
             <w:pPr>
               <w:jc w:val="center"/>
               <w:rPr>
-                <w:color w:val="000000" w:themeColor="text1"/>
+                <w:bCs/>
+                <w:color w:val="000000" w:themeColor="text1"/>
+                <w:sz w:val="26"/>
+                <w:szCs w:val="26"/>
               </w:rPr>
             </w:pPr>
             <w:r>
               <w:rPr>
                 <w:rFonts w:ascii="Times New Roman" w:hAnsi="Times New Roman"/>
-                <w:color w:val="000000" w:themeColor="text1"/>
-                <w:sz w:val="17"/>
+                <w:bCs/>
+                <w:color w:val="000000" w:themeColor="text1"/>
+                <w:sz w:val="26"/>
+                <w:szCs w:val="26"/>
               </w:rPr>
               <w:t>0.1412 ± 0.050</w:t>
             </w:r>
@@ -4967,14 +5737,19 @@
             <w:pPr>
               <w:jc w:val="center"/>
               <w:rPr>
-                <w:color w:val="000000" w:themeColor="text1"/>
+                <w:bCs/>
+                <w:color w:val="000000" w:themeColor="text1"/>
+                <w:sz w:val="26"/>
+                <w:szCs w:val="26"/>
               </w:rPr>
             </w:pPr>
             <w:r>
               <w:rPr>
                 <w:rFonts w:ascii="Times New Roman" w:hAnsi="Times New Roman"/>
-                <w:color w:val="000000" w:themeColor="text1"/>
-                <w:sz w:val="17"/>
+                <w:bCs/>
+                <w:color w:val="000000" w:themeColor="text1"/>
+                <w:sz w:val="26"/>
+                <w:szCs w:val="26"/>
               </w:rPr>
               <w:t>–</w:t>
             </w:r>
@@ -5000,14 +5775,19 @@
             <w:pPr>
               <w:jc w:val="center"/>
               <w:rPr>
-                <w:color w:val="000000" w:themeColor="text1"/>
+                <w:bCs/>
+                <w:color w:val="000000" w:themeColor="text1"/>
+                <w:sz w:val="26"/>
+                <w:szCs w:val="26"/>
               </w:rPr>
             </w:pPr>
             <w:r>
               <w:rPr>
                 <w:rFonts w:ascii="Times New Roman" w:hAnsi="Times New Roman"/>
-                <w:color w:val="000000" w:themeColor="text1"/>
-                <w:sz w:val="17"/>
+                <w:bCs/>
+                <w:color w:val="000000" w:themeColor="text1"/>
+                <w:sz w:val="26"/>
+                <w:szCs w:val="26"/>
               </w:rPr>
               <w:t>Sklearn</w:t>
             </w:r>
@@ -5027,14 +5807,19 @@
           <w:p>
             <w:pPr>
               <w:rPr>
-                <w:color w:val="000000" w:themeColor="text1"/>
+                <w:bCs/>
+                <w:color w:val="000000" w:themeColor="text1"/>
+                <w:sz w:val="26"/>
+                <w:szCs w:val="26"/>
               </w:rPr>
             </w:pPr>
             <w:r>
               <w:rPr>
                 <w:rFonts w:ascii="Times New Roman" w:hAnsi="Times New Roman"/>
-                <w:color w:val="000000" w:themeColor="text1"/>
-                <w:sz w:val="17"/>
+                <w:bCs/>
+                <w:color w:val="000000" w:themeColor="text1"/>
+                <w:sz w:val="26"/>
+                <w:szCs w:val="26"/>
               </w:rPr>
               <w:t>Gradient Boosting (tuned)</w:t>
             </w:r>
@@ -5055,14 +5840,19 @@
             <w:pPr>
               <w:jc w:val="center"/>
               <w:rPr>
-                <w:color w:val="000000" w:themeColor="text1"/>
+                <w:bCs/>
+                <w:color w:val="000000" w:themeColor="text1"/>
+                <w:sz w:val="26"/>
+                <w:szCs w:val="26"/>
               </w:rPr>
             </w:pPr>
             <w:r>
               <w:rPr>
                 <w:rFonts w:ascii="Times New Roman" w:hAnsi="Times New Roman"/>
-                <w:color w:val="000000" w:themeColor="text1"/>
-                <w:sz w:val="17"/>
+                <w:bCs/>
+                <w:color w:val="000000" w:themeColor="text1"/>
+                <w:sz w:val="26"/>
+                <w:szCs w:val="26"/>
               </w:rPr>
               <w:t>0.1365</w:t>
             </w:r>
@@ -5083,14 +5873,19 @@
             <w:pPr>
               <w:jc w:val="center"/>
               <w:rPr>
-                <w:color w:val="000000" w:themeColor="text1"/>
+                <w:bCs/>
+                <w:color w:val="000000" w:themeColor="text1"/>
+                <w:sz w:val="26"/>
+                <w:szCs w:val="26"/>
               </w:rPr>
             </w:pPr>
             <w:r>
               <w:rPr>
                 <w:rFonts w:ascii="Times New Roman" w:hAnsi="Times New Roman"/>
-                <w:color w:val="000000" w:themeColor="text1"/>
-                <w:sz w:val="17"/>
+                <w:bCs/>
+                <w:color w:val="000000" w:themeColor="text1"/>
+                <w:sz w:val="26"/>
+                <w:szCs w:val="26"/>
               </w:rPr>
               <w:t>0.9002</w:t>
             </w:r>
@@ -5111,16 +5906,32 @@
             <w:pPr>
               <w:jc w:val="center"/>
               <w:rPr>
-                <w:color w:val="000000" w:themeColor="text1"/>
+                <w:bCs/>
+                <w:color w:val="000000" w:themeColor="text1"/>
+                <w:sz w:val="26"/>
+                <w:szCs w:val="26"/>
               </w:rPr>
             </w:pPr>
             <w:r>
               <w:rPr>
                 <w:rFonts w:ascii="Times New Roman" w:hAnsi="Times New Roman"/>
-                <w:color w:val="000000" w:themeColor="text1"/>
-                <w:sz w:val="17"/>
-              </w:rPr>
-              <w:t>0.1269 ± 0.024</w:t>
+                <w:bCs/>
+                <w:color w:val="000000" w:themeColor="text1"/>
+                <w:sz w:val="26"/>
+                <w:szCs w:val="26"/>
+              </w:rPr>
+              <w:t xml:space="preserve">0.1269 ± </w:t>
+            </w:r>
+            <w:r>
+              <w:rPr>
+                <w:rFonts w:ascii="Times New Roman" w:hAnsi="Times New Roman"/>
+                <w:bCs/>
+                <w:color w:val="000000" w:themeColor="text1"/>
+                <w:sz w:val="26"/>
+                <w:szCs w:val="26"/>
+              </w:rPr>
+              <w:lastRenderedPageBreak/>
+              <w:t>0.024</w:t>
             </w:r>
           </w:p>
         </w:tc>
@@ -5139,15 +5950,21 @@
             <w:pPr>
               <w:jc w:val="center"/>
               <w:rPr>
-                <w:color w:val="000000" w:themeColor="text1"/>
+                <w:bCs/>
+                <w:color w:val="000000" w:themeColor="text1"/>
+                <w:sz w:val="26"/>
+                <w:szCs w:val="26"/>
               </w:rPr>
             </w:pPr>
             <w:r>
               <w:rPr>
                 <w:rFonts w:ascii="Times New Roman" w:hAnsi="Times New Roman"/>
-                <w:color w:val="000000" w:themeColor="text1"/>
-                <w:sz w:val="17"/>
-              </w:rPr>
+                <w:bCs/>
+                <w:color w:val="000000" w:themeColor="text1"/>
+                <w:sz w:val="26"/>
+                <w:szCs w:val="26"/>
+              </w:rPr>
+              <w:lastRenderedPageBreak/>
               <w:t>–</w:t>
             </w:r>
           </w:p>
@@ -5172,14 +5989,19 @@
             <w:pPr>
               <w:jc w:val="center"/>
               <w:rPr>
-                <w:color w:val="000000" w:themeColor="text1"/>
+                <w:bCs/>
+                <w:color w:val="000000" w:themeColor="text1"/>
+                <w:sz w:val="26"/>
+                <w:szCs w:val="26"/>
               </w:rPr>
             </w:pPr>
             <w:r>
               <w:rPr>
                 <w:rFonts w:ascii="Times New Roman" w:hAnsi="Times New Roman"/>
-                <w:color w:val="000000" w:themeColor="text1"/>
-                <w:sz w:val="17"/>
+                <w:bCs/>
+                <w:color w:val="000000" w:themeColor="text1"/>
+                <w:sz w:val="26"/>
+                <w:szCs w:val="26"/>
               </w:rPr>
               <w:t>Sklearn</w:t>
             </w:r>
@@ -5199,14 +6021,19 @@
           <w:p>
             <w:pPr>
               <w:rPr>
-                <w:color w:val="000000" w:themeColor="text1"/>
+                <w:bCs/>
+                <w:color w:val="000000" w:themeColor="text1"/>
+                <w:sz w:val="26"/>
+                <w:szCs w:val="26"/>
               </w:rPr>
             </w:pPr>
             <w:r>
               <w:rPr>
                 <w:rFonts w:ascii="Times New Roman" w:hAnsi="Times New Roman"/>
-                <w:color w:val="000000" w:themeColor="text1"/>
-                <w:sz w:val="17"/>
+                <w:bCs/>
+                <w:color w:val="000000" w:themeColor="text1"/>
+                <w:sz w:val="26"/>
+                <w:szCs w:val="26"/>
               </w:rPr>
               <w:t>HistGB (tuned)</w:t>
             </w:r>
@@ -5227,14 +6054,19 @@
             <w:pPr>
               <w:jc w:val="center"/>
               <w:rPr>
-                <w:color w:val="000000" w:themeColor="text1"/>
+                <w:bCs/>
+                <w:color w:val="000000" w:themeColor="text1"/>
+                <w:sz w:val="26"/>
+                <w:szCs w:val="26"/>
               </w:rPr>
             </w:pPr>
             <w:r>
               <w:rPr>
                 <w:rFonts w:ascii="Times New Roman" w:hAnsi="Times New Roman"/>
-                <w:color w:val="000000" w:themeColor="text1"/>
-                <w:sz w:val="17"/>
+                <w:bCs/>
+                <w:color w:val="000000" w:themeColor="text1"/>
+                <w:sz w:val="26"/>
+                <w:szCs w:val="26"/>
               </w:rPr>
               <w:t>0.1405</w:t>
             </w:r>
@@ -5255,14 +6087,19 @@
             <w:pPr>
               <w:jc w:val="center"/>
               <w:rPr>
-                <w:color w:val="000000" w:themeColor="text1"/>
+                <w:bCs/>
+                <w:color w:val="000000" w:themeColor="text1"/>
+                <w:sz w:val="26"/>
+                <w:szCs w:val="26"/>
               </w:rPr>
             </w:pPr>
             <w:r>
               <w:rPr>
                 <w:rFonts w:ascii="Times New Roman" w:hAnsi="Times New Roman"/>
-                <w:color w:val="000000" w:themeColor="text1"/>
-                <w:sz w:val="17"/>
+                <w:bCs/>
+                <w:color w:val="000000" w:themeColor="text1"/>
+                <w:sz w:val="26"/>
+                <w:szCs w:val="26"/>
               </w:rPr>
               <w:t>0.8942</w:t>
             </w:r>
@@ -5283,14 +6120,19 @@
             <w:pPr>
               <w:jc w:val="center"/>
               <w:rPr>
-                <w:color w:val="000000" w:themeColor="text1"/>
+                <w:bCs/>
+                <w:color w:val="000000" w:themeColor="text1"/>
+                <w:sz w:val="26"/>
+                <w:szCs w:val="26"/>
               </w:rPr>
             </w:pPr>
             <w:r>
               <w:rPr>
                 <w:rFonts w:ascii="Times New Roman" w:hAnsi="Times New Roman"/>
-                <w:color w:val="000000" w:themeColor="text1"/>
-                <w:sz w:val="17"/>
+                <w:bCs/>
+                <w:color w:val="000000" w:themeColor="text1"/>
+                <w:sz w:val="26"/>
+                <w:szCs w:val="26"/>
               </w:rPr>
               <w:t>0.1299 ± 0.022</w:t>
             </w:r>
@@ -5311,14 +6153,19 @@
             <w:pPr>
               <w:jc w:val="center"/>
               <w:rPr>
-                <w:color w:val="000000" w:themeColor="text1"/>
+                <w:bCs/>
+                <w:color w:val="000000" w:themeColor="text1"/>
+                <w:sz w:val="26"/>
+                <w:szCs w:val="26"/>
               </w:rPr>
             </w:pPr>
             <w:r>
               <w:rPr>
                 <w:rFonts w:ascii="Times New Roman" w:hAnsi="Times New Roman"/>
-                <w:color w:val="000000" w:themeColor="text1"/>
-                <w:sz w:val="17"/>
+                <w:bCs/>
+                <w:color w:val="000000" w:themeColor="text1"/>
+                <w:sz w:val="26"/>
+                <w:szCs w:val="26"/>
               </w:rPr>
               <w:t>–</w:t>
             </w:r>
@@ -5344,15 +6191,19 @@
             <w:pPr>
               <w:jc w:val="center"/>
               <w:rPr>
-                <w:color w:val="000000" w:themeColor="text1"/>
+                <w:bCs/>
+                <w:color w:val="000000" w:themeColor="text1"/>
+                <w:sz w:val="26"/>
+                <w:szCs w:val="26"/>
               </w:rPr>
             </w:pPr>
             <w:r>
               <w:rPr>
                 <w:rFonts w:ascii="Times New Roman" w:hAnsi="Times New Roman"/>
-                <w:b/>
-                <w:color w:val="000000" w:themeColor="text1"/>
-                <w:sz w:val="17"/>
+                <w:bCs/>
+                <w:color w:val="000000" w:themeColor="text1"/>
+                <w:sz w:val="26"/>
+                <w:szCs w:val="26"/>
               </w:rPr>
               <w:t>Sklearn (B)</w:t>
             </w:r>
@@ -5372,17 +6223,21 @@
           <w:p>
             <w:pPr>
               <w:rPr>
-                <w:color w:val="000000" w:themeColor="text1"/>
+                <w:bCs/>
+                <w:color w:val="000000" w:themeColor="text1"/>
+                <w:sz w:val="26"/>
+                <w:szCs w:val="26"/>
               </w:rPr>
             </w:pPr>
             <w:r>
               <w:rPr>
                 <w:rFonts w:ascii="Times New Roman" w:hAnsi="Times New Roman"/>
-                <w:b/>
-                <w:color w:val="000000" w:themeColor="text1"/>
-                <w:sz w:val="17"/>
-              </w:rPr>
-              <w:t>Ensemble 4 mô hình (Nộp B)</w:t>
+                <w:bCs/>
+                <w:color w:val="000000" w:themeColor="text1"/>
+                <w:sz w:val="26"/>
+                <w:szCs w:val="26"/>
+              </w:rPr>
+              <w:t>Ensemble 4 mô hình</w:t>
             </w:r>
           </w:p>
         </w:tc>
@@ -5401,15 +6256,19 @@
             <w:pPr>
               <w:jc w:val="center"/>
               <w:rPr>
-                <w:color w:val="000000" w:themeColor="text1"/>
+                <w:bCs/>
+                <w:color w:val="000000" w:themeColor="text1"/>
+                <w:sz w:val="26"/>
+                <w:szCs w:val="26"/>
               </w:rPr>
             </w:pPr>
             <w:r>
               <w:rPr>
                 <w:rFonts w:ascii="Times New Roman" w:hAnsi="Times New Roman"/>
-                <w:b/>
-                <w:color w:val="000000" w:themeColor="text1"/>
-                <w:sz w:val="17"/>
+                <w:bCs/>
+                <w:color w:val="000000" w:themeColor="text1"/>
+                <w:sz w:val="26"/>
+                <w:szCs w:val="26"/>
               </w:rPr>
               <w:t>0.1244</w:t>
             </w:r>
@@ -5430,15 +6289,19 @@
             <w:pPr>
               <w:jc w:val="center"/>
               <w:rPr>
-                <w:color w:val="000000" w:themeColor="text1"/>
+                <w:bCs/>
+                <w:color w:val="000000" w:themeColor="text1"/>
+                <w:sz w:val="26"/>
+                <w:szCs w:val="26"/>
               </w:rPr>
             </w:pPr>
             <w:r>
               <w:rPr>
                 <w:rFonts w:ascii="Times New Roman" w:hAnsi="Times New Roman"/>
-                <w:b/>
-                <w:color w:val="000000" w:themeColor="text1"/>
-                <w:sz w:val="17"/>
+                <w:bCs/>
+                <w:color w:val="000000" w:themeColor="text1"/>
+                <w:sz w:val="26"/>
+                <w:szCs w:val="26"/>
               </w:rPr>
               <w:t>0.9171</w:t>
             </w:r>
@@ -5459,15 +6322,19 @@
             <w:pPr>
               <w:jc w:val="center"/>
               <w:rPr>
-                <w:color w:val="000000" w:themeColor="text1"/>
+                <w:bCs/>
+                <w:color w:val="000000" w:themeColor="text1"/>
+                <w:sz w:val="26"/>
+                <w:szCs w:val="26"/>
               </w:rPr>
             </w:pPr>
             <w:r>
               <w:rPr>
                 <w:rFonts w:ascii="Times New Roman" w:hAnsi="Times New Roman"/>
-                <w:b/>
-                <w:color w:val="000000" w:themeColor="text1"/>
-                <w:sz w:val="17"/>
+                <w:bCs/>
+                <w:color w:val="000000" w:themeColor="text1"/>
+                <w:sz w:val="26"/>
+                <w:szCs w:val="26"/>
               </w:rPr>
               <w:t>0.1259 ± 0.035</w:t>
             </w:r>
@@ -5488,15 +6355,19 @@
             <w:pPr>
               <w:jc w:val="center"/>
               <w:rPr>
-                <w:color w:val="000000" w:themeColor="text1"/>
+                <w:bCs/>
+                <w:color w:val="000000" w:themeColor="text1"/>
+                <w:sz w:val="26"/>
+                <w:szCs w:val="26"/>
               </w:rPr>
             </w:pPr>
             <w:r>
               <w:rPr>
                 <w:rFonts w:ascii="Times New Roman" w:hAnsi="Times New Roman"/>
-                <w:b/>
-                <w:color w:val="000000" w:themeColor="text1"/>
-                <w:sz w:val="17"/>
+                <w:bCs/>
+                <w:color w:val="000000" w:themeColor="text1"/>
+                <w:sz w:val="26"/>
+                <w:szCs w:val="26"/>
               </w:rPr>
               <w:t>0.12573</w:t>
             </w:r>
@@ -5522,15 +6393,19 @@
             <w:pPr>
               <w:jc w:val="center"/>
               <w:rPr>
-                <w:color w:val="000000" w:themeColor="text1"/>
+                <w:bCs/>
+                <w:color w:val="000000" w:themeColor="text1"/>
+                <w:sz w:val="26"/>
+                <w:szCs w:val="26"/>
               </w:rPr>
             </w:pPr>
             <w:r>
               <w:rPr>
                 <w:rFonts w:ascii="Times New Roman" w:hAnsi="Times New Roman"/>
-                <w:b/>
-                <w:color w:val="000000" w:themeColor="text1"/>
-                <w:sz w:val="17"/>
+                <w:bCs/>
+                <w:color w:val="000000" w:themeColor="text1"/>
+                <w:sz w:val="26"/>
+                <w:szCs w:val="26"/>
               </w:rPr>
               <w:t>PyTorch (C)</w:t>
             </w:r>
@@ -5550,17 +6425,21 @@
           <w:p>
             <w:pPr>
               <w:rPr>
-                <w:color w:val="000000" w:themeColor="text1"/>
+                <w:bCs/>
+                <w:color w:val="000000" w:themeColor="text1"/>
+                <w:sz w:val="26"/>
+                <w:szCs w:val="26"/>
               </w:rPr>
             </w:pPr>
             <w:r>
               <w:rPr>
                 <w:rFonts w:ascii="Times New Roman" w:hAnsi="Times New Roman"/>
-                <w:b/>
-                <w:color w:val="000000" w:themeColor="text1"/>
-                <w:sz w:val="17"/>
-              </w:rPr>
-              <w:t>PyTorch HousePriceMLP (Nộp C)</w:t>
+                <w:bCs/>
+                <w:color w:val="000000" w:themeColor="text1"/>
+                <w:sz w:val="26"/>
+                <w:szCs w:val="26"/>
+              </w:rPr>
+              <w:t>PyTorch HousePriceMLP</w:t>
             </w:r>
           </w:p>
         </w:tc>
@@ -5579,15 +6458,19 @@
             <w:pPr>
               <w:jc w:val="center"/>
               <w:rPr>
-                <w:color w:val="000000" w:themeColor="text1"/>
+                <w:bCs/>
+                <w:color w:val="000000" w:themeColor="text1"/>
+                <w:sz w:val="26"/>
+                <w:szCs w:val="26"/>
               </w:rPr>
             </w:pPr>
             <w:r>
               <w:rPr>
                 <w:rFonts w:ascii="Times New Roman" w:hAnsi="Times New Roman"/>
-                <w:b/>
-                <w:color w:val="000000" w:themeColor="text1"/>
-                <w:sz w:val="17"/>
+                <w:bCs/>
+                <w:color w:val="000000" w:themeColor="text1"/>
+                <w:sz w:val="26"/>
+                <w:szCs w:val="26"/>
               </w:rPr>
               <w:t>0.1252</w:t>
             </w:r>
@@ -5608,15 +6491,19 @@
             <w:pPr>
               <w:jc w:val="center"/>
               <w:rPr>
-                <w:color w:val="000000" w:themeColor="text1"/>
+                <w:bCs/>
+                <w:color w:val="000000" w:themeColor="text1"/>
+                <w:sz w:val="26"/>
+                <w:szCs w:val="26"/>
               </w:rPr>
             </w:pPr>
             <w:r>
               <w:rPr>
                 <w:rFonts w:ascii="Times New Roman" w:hAnsi="Times New Roman"/>
-                <w:b/>
-                <w:color w:val="000000" w:themeColor="text1"/>
-                <w:sz w:val="17"/>
+                <w:bCs/>
+                <w:color w:val="000000" w:themeColor="text1"/>
+                <w:sz w:val="26"/>
+                <w:szCs w:val="26"/>
               </w:rPr>
               <w:t>0.9123</w:t>
             </w:r>
@@ -5637,15 +6524,19 @@
             <w:pPr>
               <w:jc w:val="center"/>
               <w:rPr>
-                <w:color w:val="000000" w:themeColor="text1"/>
+                <w:bCs/>
+                <w:color w:val="000000" w:themeColor="text1"/>
+                <w:sz w:val="26"/>
+                <w:szCs w:val="26"/>
               </w:rPr>
             </w:pPr>
             <w:r>
               <w:rPr>
                 <w:rFonts w:ascii="Times New Roman" w:hAnsi="Times New Roman"/>
-                <w:b/>
-                <w:color w:val="000000" w:themeColor="text1"/>
-                <w:sz w:val="17"/>
+                <w:bCs/>
+                <w:color w:val="000000" w:themeColor="text1"/>
+                <w:sz w:val="26"/>
+                <w:szCs w:val="26"/>
               </w:rPr>
               <w:t>0.1312 ± 0.038</w:t>
             </w:r>
@@ -5666,15 +6557,19 @@
             <w:pPr>
               <w:jc w:val="center"/>
               <w:rPr>
-                <w:color w:val="000000" w:themeColor="text1"/>
+                <w:bCs/>
+                <w:color w:val="000000" w:themeColor="text1"/>
+                <w:sz w:val="26"/>
+                <w:szCs w:val="26"/>
               </w:rPr>
             </w:pPr>
             <w:r>
               <w:rPr>
                 <w:rFonts w:ascii="Times New Roman" w:hAnsi="Times New Roman"/>
-                <w:b/>
-                <w:color w:val="000000" w:themeColor="text1"/>
-                <w:sz w:val="17"/>
+                <w:bCs/>
+                <w:color w:val="000000" w:themeColor="text1"/>
+                <w:sz w:val="26"/>
+                <w:szCs w:val="26"/>
               </w:rPr>
               <w:t>0.12845</w:t>
             </w:r>
@@ -5727,17 +6622,32 @@
           <w:sz w:val="30"/>
         </w:rPr>
         <w:lastRenderedPageBreak/>
-        <w:t>7. KẾT LUẬN &amp; ĐÓNG GÓI BÀI NỘP</w:t>
+        <w:t xml:space="preserve">7. </w:t>
+      </w:r>
+      <w:r>
+        <w:rPr>
+          <w:rFonts w:ascii="Times New Roman" w:hAnsi="Times New Roman"/>
+          <w:b/>
+          <w:color w:val="000000" w:themeColor="text1"/>
+          <w:sz w:val="30"/>
+        </w:rPr>
+        <w:t>Kết luận</w:t>
       </w:r>
     </w:p>
     <w:p>
       <w:pPr>
         <w:pStyle w:val="ListBullet"/>
         <w:spacing w:after="60"/>
+        <w:rPr>
+          <w:sz w:val="26"/>
+          <w:szCs w:val="26"/>
+        </w:rPr>
       </w:pPr>
       <w:r>
         <w:rPr>
           <w:rFonts w:ascii="Times New Roman" w:hAnsi="Times New Roman"/>
+          <w:sz w:val="26"/>
+          <w:szCs w:val="26"/>
         </w:rPr>
         <w:t>Cả hai nhánh mô hình (Sklearn Ensemble và PyTorch MLP) đều đạt kết quả xuất sắc (Val RMSE ~0.124–0.125, điểm Kaggle 0.12573).</w:t>
       </w:r>
@@ -5746,10 +6656,16 @@
       <w:pPr>
         <w:pStyle w:val="ListBullet"/>
         <w:spacing w:after="60"/>
+        <w:rPr>
+          <w:sz w:val="26"/>
+          <w:szCs w:val="26"/>
+        </w:rPr>
       </w:pPr>
       <w:r>
         <w:rPr>
           <w:rFonts w:ascii="Times New Roman" w:hAnsi="Times New Roman"/>
+          <w:sz w:val="26"/>
+          <w:szCs w:val="26"/>
         </w:rPr>
         <w:t>Mô hình Ensemble cây + tuyến tính thể hiện độ ổn định vượt trội trên dữ liệu dạng bảng.</w:t>
       </w:r>
@@ -5758,10 +6674,16 @@
       <w:pPr>
         <w:pStyle w:val="ListBullet"/>
         <w:spacing w:after="60"/>
+        <w:rPr>
+          <w:sz w:val="26"/>
+          <w:szCs w:val="26"/>
+        </w:rPr>
       </w:pPr>
       <w:r>
         <w:rPr>
           <w:rFonts w:ascii="Times New Roman" w:hAnsi="Times New Roman"/>
+          <w:sz w:val="26"/>
+          <w:szCs w:val="26"/>
         </w:rPr>
         <w:t>Mạng nơ-ron PyTorch MLP chứng minh tiềm năng biểu diễn phi tuyến mạnh mẽ nếu được chuẩn hóa target và áp dụng Dropout điều chuẩn đúng cách.</w:t>
       </w:r>
@@ -5770,10 +6692,16 @@
       <w:pPr>
         <w:pStyle w:val="ListBullet"/>
         <w:spacing w:after="60"/>
+        <w:rPr>
+          <w:sz w:val="26"/>
+          <w:szCs w:val="26"/>
+        </w:rPr>
       </w:pPr>
       <w:r>
         <w:rPr>
           <w:rFonts w:ascii="Times New Roman" w:hAnsi="Times New Roman"/>
+          <w:sz w:val="26"/>
+          <w:szCs w:val="26"/>
         </w:rPr>
         <w:t>Toàn bộ sản phẩm bài làm đã được tổ chức khoa học, chạy nghiệm thu thực tế và đóng gói thành tệp nén theo đúng quy định.</w:t>
       </w:r>

</xml_diff>